<commit_message>
docs: resolve math parsing formatting in docx document
</commit_message>
<xml_diff>
--- a/reports/SLAS_Technology_Manuscript_Draft.docx
+++ b/reports/SLAS_Technology_Manuscript_Draft.docx
@@ -400,7 +400,13 @@
         <w:t>.ch</w:t>
       </w:r>
       <w:r>
-        <w:t xml:space="preserve"> FID files. This parser automatically detects version signatures, decodes absolute starting values and 16-bit/32-bit delta-compressed integer streams, and scales intensities by the header's scaling factor without external runtime dependencies. It extracts retention times, intensity values, and m/z spectra directly into memory.</w:t>
+        <w:t xml:space="preserve"> FID files. This parser automatically detects version signatures, decodes absolute starting values and 16-bit/32-bit delta-compressed integer streams, and scales intensities by the header's scaling factor without external runtime dependencies. It extracts retention times, intensity values, and </w:t>
+      </w:r>
+      <w:r>
+        <w:t>m/z</w:t>
+      </w:r>
+      <w:r>
+        <w:t xml:space="preserve"> spectra directly into memory.</w:t>
       </w:r>
     </w:p>
     <w:p>
@@ -416,84 +422,109 @@
         <w:t>Baseline Correction:</w:t>
       </w:r>
       <w:r>
-        <w:t xml:space="preserve"> Column bleed and baseline drift can ruin peak calculations. We apply Asymmetric Least Squares (ALS) baseline correction. The corrected signal vector z is computed by minimizing the penalized objective function:</w:t>
+        <w:t xml:space="preserve"> Column bleed and baseline drift can ruin peak calculations. We apply Asymmetric Least Squares (ALS) baseline correction. The corrected signal vector </w:t>
+      </w:r>
+      <w:r>
+        <w:t>z</w:t>
+      </w:r>
+      <w:r>
+        <w:t xml:space="preserve"> is computed by minimizing the penalized objective function:</w:t>
       </w:r>
     </w:p>
     <w:p>
       <w:pPr>
         <w:spacing w:after="120" w:line="276" w:lineRule="auto"/>
       </w:pPr>
-      <w:r>
-        <w:t>S = Σ w</w:t>
-      </w:r>
-      <w:r>
-        <w:rPr>
-          <w:i/>
-        </w:rPr>
-        <w:t>i(y</w:t>
-      </w:r>
-      <w:r>
-        <w:t>i - z</w:t>
-      </w:r>
-      <w:r>
-        <w:rPr>
-          <w:i/>
-        </w:rPr>
-        <w:t>i)² + λ Σ (Δ²z</w:t>
-      </w:r>
-      <w:r>
-        <w:t>i)²</w:t>
-      </w:r>
+      <w:r/>
+      <w:r>
+        <w:t>S = Σ w_i(y_i - z_i)² + λ Σ (Δ²z_i)²</w:t>
+      </w:r>
+      <w:r/>
     </w:p>
     <w:p>
       <w:pPr>
         <w:spacing w:after="120" w:line="276" w:lineRule="auto"/>
       </w:pPr>
       <w:r>
-        <w:t>where y</w:t>
-      </w:r>
-      <w:r>
-        <w:rPr>
-          <w:i/>
-        </w:rPr>
-        <w:t>i is the raw intensity, z</w:t>
-      </w:r>
-      <w:r>
-        <w:t>i is the baseline, Δ^2 is the second-order difference operator, and λ is a smoothness parameter (set between 10^3 and 10^6). The asymmetric weights w_i are:</w:t>
+        <w:t xml:space="preserve">where </w:t>
+      </w:r>
+      <w:r>
+        <w:t>y_i</w:t>
+      </w:r>
+      <w:r>
+        <w:t xml:space="preserve"> is the raw intensity, </w:t>
+      </w:r>
+      <w:r>
+        <w:t>z_i</w:t>
+      </w:r>
+      <w:r>
+        <w:t xml:space="preserve"> is the baseline, </w:t>
+      </w:r>
+      <w:r>
+        <w:t>Δ^2</w:t>
+      </w:r>
+      <w:r>
+        <w:t xml:space="preserve"> is the second-order difference operator, and </w:t>
+      </w:r>
+      <w:r>
+        <w:t>λ</w:t>
+      </w:r>
+      <w:r>
+        <w:t xml:space="preserve"> is a smoothness parameter (set between </w:t>
+      </w:r>
+      <w:r>
+        <w:t>10^3</w:t>
+      </w:r>
+      <w:r>
+        <w:t xml:space="preserve"> and </w:t>
+      </w:r>
+      <w:r>
+        <w:t>10^6</w:t>
+      </w:r>
+      <w:r>
+        <w:t xml:space="preserve">). The asymmetric weights </w:t>
+      </w:r>
+      <w:r>
+        <w:t>w_i</w:t>
+      </w:r>
+      <w:r>
+        <w:t xml:space="preserve"> are:</w:t>
       </w:r>
     </w:p>
     <w:p>
       <w:pPr>
         <w:spacing w:after="120" w:line="276" w:lineRule="auto"/>
       </w:pPr>
-      <w:r>
-        <w:t>w</w:t>
-      </w:r>
-      <w:r>
-        <w:rPr>
-          <w:i/>
-        </w:rPr>
-        <w:t>i = p if y</w:t>
-      </w:r>
-      <w:r>
-        <w:t>i &gt; z</w:t>
-      </w:r>
-      <w:r>
-        <w:rPr>
-          <w:i/>
-        </w:rPr>
-        <w:t>i, or 1-p if y</w:t>
-      </w:r>
-      <w:r>
-        <w:t>i ≤ z_i</w:t>
-      </w:r>
+      <w:r/>
+      <w:r>
+        <w:t>w_i = p if y_i &gt; z_i, or 1-p if y_i ≤ z_i</w:t>
+      </w:r>
+      <w:r/>
     </w:p>
     <w:p>
       <w:pPr>
         <w:spacing w:after="120" w:line="276" w:lineRule="auto"/>
       </w:pPr>
       <w:r>
-        <w:t>We keep the asymmetry parameter p between 0.001 and 0.01 so the baseline doesn't eat into the real peaks.</w:t>
+        <w:t xml:space="preserve">We keep the asymmetry parameter </w:t>
+      </w:r>
+      <w:r>
+        <w:t>p</w:t>
+      </w:r>
+      <w:r>
+        <w:t xml:space="preserve"> between </w:t>
+      </w:r>
+      <w:r>
+        <w:t>0.001</w:t>
+      </w:r>
+      <w:r>
+        <w:t xml:space="preserve"> and </w:t>
+      </w:r>
+      <w:r>
+        <w:t>0.01</w:t>
+      </w:r>
+      <w:r>
+        <w:t xml:space="preserve"> so the baseline doesn't eat into the real peaks.</w:t>
       </w:r>
     </w:p>
     <w:p>
@@ -535,15 +566,365 @@
         <w:pStyle w:val="ListBullet"/>
         <w:spacing w:after="60"/>
       </w:pPr>
+      <w:r>
+        <w:t>*USP Tailing Factor (</w:t>
+      </w:r>
+      <w:r>
+        <w:t>T</w:t>
+      </w:r>
+      <w:r>
+        <w:t xml:space="preserve">):* Evaluated at 5% peak height: </w:t>
+      </w:r>
+      <w:r>
+        <w:t>T = W_{0.05} / (2f)</w:t>
+      </w:r>
+      <w:r>
+        <w:t xml:space="preserve"> with sub-point interpolation.</w:t>
+      </w:r>
+    </w:p>
+    <w:p>
+      <w:pPr>
+        <w:pStyle w:val="ListBullet"/>
+        <w:spacing w:after="60"/>
+      </w:pPr>
+      <w:r>
+        <w:t>*Theoretical Plate Count (</w:t>
+      </w:r>
+      <w:r>
+        <w:t>N</w:t>
+      </w:r>
+      <w:r>
+        <w:t xml:space="preserve">):* Evaluated at 50% peak height: </w:t>
+      </w:r>
+      <w:r>
+        <w:t>N = 5.54 (tR / W_{0.5})^2</w:t>
+      </w:r>
+      <w:r>
+        <w:t>.</w:t>
+      </w:r>
+    </w:p>
+    <w:p>
+      <w:pPr>
+        <w:pStyle w:val="ListBullet"/>
+        <w:spacing w:after="60"/>
+      </w:pPr>
+      <w:r>
+        <w:t>*USP Peak Resolution (</w:t>
+      </w:r>
+      <w:r>
+        <w:t>Rs</w:t>
+      </w:r>
+      <w:r>
+        <w:t xml:space="preserve">):* Evaluated between adjacent peaks: </w:t>
+      </w:r>
+      <w:r>
+        <w:t>Rs = 2(t_{R2} - t_{R1}) / (w_1 + w_2)</w:t>
+      </w:r>
+      <w:r>
+        <w:t>.</w:t>
+      </w:r>
+    </w:p>
+    <w:p>
+      <w:pPr>
+        <w:pStyle w:val="ListBullet"/>
+        <w:spacing w:after="60"/>
+      </w:pPr>
+      <w:r>
+        <w:t>*Signal-to-Noise Ratio (</w:t>
+      </w:r>
+      <w:r>
+        <w:t>S/N</w:t>
+      </w:r>
+      <w:r>
+        <w:t>):* Calculates baseline noise standard deviation from signal points outside of all peak regions.</w:t>
+      </w:r>
+    </w:p>
+    <w:p>
+      <w:pPr>
+        <w:spacing w:after="120" w:line="276" w:lineRule="auto"/>
+      </w:pPr>
+      <w:r>
+        <w:t>Once validated, peak areas are integrated using the trapezoidal rule:</w:t>
+      </w:r>
+    </w:p>
+    <w:p>
+      <w:pPr>
+        <w:spacing w:after="120" w:line="276" w:lineRule="auto"/>
+      </w:pPr>
       <w:r/>
       <w:r>
+        <w:t>A = Σ [ (y_(i-1) + y_i) / 2 ] * (x_i - x_(i-1))</w:t>
+      </w:r>
+      <w:r/>
+    </w:p>
+    <w:p>
+      <w:pPr>
+        <w:spacing w:after="120" w:line="276" w:lineRule="auto"/>
+      </w:pPr>
+      <w:r>
+        <w:t>We set strict bounds to ensure we don't end up with negative areas.</w:t>
+      </w:r>
+    </w:p>
+    <w:p>
+      <w:pPr>
+        <w:pStyle w:val="ListNumber"/>
+        <w:spacing w:after="60"/>
+      </w:pPr>
+      <w:r/>
+      <w:r>
         <w:rPr>
-          <w:i/>
+          <w:b/>
         </w:rPr>
-        <w:t>USP Tailing Factor (T):</w:t>
-      </w:r>
-      <w:r>
-        <w:t xml:space="preserve"> Evaluated at 5% peak height: T = W_{0.05} / (2f) with sub-point interpolation.</w:t>
+        <w:t>GNN-Based Peak Deconvolution &amp; Hybrid Curve Fitting:</w:t>
+      </w:r>
+      <w:r>
+        <w:t xml:space="preserve"> Standard integration methods fail when peaks overlap, double-counting the shared signal area. We solve this by building a 1D temporal-spectral graph </w:t>
+      </w:r>
+      <w:r>
+        <w:t>G = (V, E)</w:t>
+      </w:r>
+      <w:r>
+        <w:t xml:space="preserve"> for each co-eluting region where scan steps are nodes </w:t>
+      </w:r>
+      <w:r>
+        <w:t>v_i ∈ V</w:t>
+      </w:r>
+      <w:r>
+        <w:t xml:space="preserve"> and edges </w:t>
+      </w:r>
+      <w:r>
+        <w:t>e_{ij} ∈ E</w:t>
+      </w:r>
+      <w:r>
+        <w:t xml:space="preserve"> connect adjacent time points.</w:t>
+      </w:r>
+    </w:p>
+    <w:p>
+      <w:pPr>
+        <w:spacing w:after="120" w:line="276" w:lineRule="auto"/>
+      </w:pPr>
+      <w:r>
+        <w:t xml:space="preserve">We introduce </w:t>
+      </w:r>
+      <w:r>
+        <w:rPr>
+          <w:b/>
+        </w:rPr>
+        <w:t>Adaptive GNN Thresholding</w:t>
+      </w:r>
+      <w:r>
+        <w:t xml:space="preserve"> to dynamically optimize the GCN graph connectivity parameter (temporal proximity threshold </w:t>
+      </w:r>
+      <w:r>
+        <w:t>θ_p</w:t>
+      </w:r>
+      <w:r>
+        <w:t>) based on local peak density, widths, and spectral similarity:</w:t>
+      </w:r>
+    </w:p>
+    <w:p>
+      <w:pPr>
+        <w:spacing w:after="120" w:line="276" w:lineRule="auto"/>
+      </w:pPr>
+      <w:r/>
+      <w:r>
+        <w:t>θ_p = clip( W_norm × 1.5 × (1 / √K) × (1 - 0.25 * C_avg), 0.1, 0.7 )</w:t>
+      </w:r>
+      <w:r/>
+    </w:p>
+    <w:p>
+      <w:pPr>
+        <w:spacing w:after="120" w:line="276" w:lineRule="auto"/>
+      </w:pPr>
+      <w:r>
+        <w:t xml:space="preserve">where </w:t>
+      </w:r>
+      <w:r>
+        <w:t>W_norm</w:t>
+      </w:r>
+      <w:r>
+        <w:t xml:space="preserve"> is the average normalized peak width, </w:t>
+      </w:r>
+      <w:r>
+        <w:t>K</w:t>
+      </w:r>
+      <w:r>
+        <w:t xml:space="preserve"> is the number of co-eluting peaks, and </w:t>
+      </w:r>
+      <w:r>
+        <w:t>C_avg</w:t>
+      </w:r>
+      <w:r>
+        <w:t xml:space="preserve"> is the average pairwise spectral cosine similarity between peak apexes. This prevents graph over-smoothing in dense or highly-correlated clusters.</w:t>
+      </w:r>
+    </w:p>
+    <w:p>
+      <w:pPr>
+        <w:spacing w:after="120" w:line="276" w:lineRule="auto"/>
+      </w:pPr>
+      <w:r>
+        <w:t xml:space="preserve">A two-layer Graph Convolutional Network (GCN) classifies the nodes and predicts component purity scores. Using these GCN priors, the system fits an </w:t>
+      </w:r>
+      <w:r>
+        <w:rPr>
+          <w:b/>
+        </w:rPr>
+        <w:t>Exponentially Modified Gaussian (EMG)</w:t>
+      </w:r>
+      <w:r>
+        <w:t xml:space="preserve"> curve model to the peaks via non-linear optimization:</w:t>
+      </w:r>
+    </w:p>
+    <w:p>
+      <w:pPr>
+        <w:spacing w:after="120" w:line="276" w:lineRule="auto"/>
+      </w:pPr>
+      <w:r/>
+      <w:r>
+        <w:t>f(t; h, t_R, σ, τ) = h * (σ/τ) * √(π/2) * exp( σ²/(2τ²) - (t - t_R)/τ ) * erfc( σ/(√2 * τ) - (t - t_R)/(√2 * σ) )</w:t>
+      </w:r>
+      <w:r/>
+    </w:p>
+    <w:p>
+      <w:pPr>
+        <w:spacing w:after="120" w:line="276" w:lineRule="auto"/>
+      </w:pPr>
+      <w:r>
+        <w:t xml:space="preserve">where </w:t>
+      </w:r>
+      <w:r>
+        <w:t>h</w:t>
+      </w:r>
+      <w:r>
+        <w:t xml:space="preserve"> is height, </w:t>
+      </w:r>
+      <w:r>
+        <w:t>tR</w:t>
+      </w:r>
+      <w:r>
+        <w:t xml:space="preserve"> is retention time, </w:t>
+      </w:r>
+      <w:r>
+        <w:t>σ</w:t>
+      </w:r>
+      <w:r>
+        <w:t xml:space="preserve"> is Gaussian width, and </w:t>
+      </w:r>
+      <w:r>
+        <w:t>τ</w:t>
+      </w:r>
+      <w:r>
+        <w:t xml:space="preserve"> is exponential relaxation time. To prevent CPU hangs on large clusters (</w:t>
+      </w:r>
+      <w:r>
+        <w:t>K &gt; 5</w:t>
+      </w:r>
+      <w:r>
+        <w:t>), a fallback mechanism automatically skips non-linear curve fitting and resolves areas directly from fast GCN node class probabilities.</w:t>
+      </w:r>
+    </w:p>
+    <w:p>
+      <w:pPr>
+        <w:spacing w:after="120" w:line="276" w:lineRule="auto"/>
+      </w:pPr>
+      <w:r>
+        <w:t>The GCN classification is calculated as:</w:t>
+      </w:r>
+    </w:p>
+    <w:p>
+      <w:pPr>
+        <w:spacing w:after="120" w:line="276" w:lineRule="auto"/>
+      </w:pPr>
+      <w:r/>
+      <w:r>
+        <w:t>h_i^(l+1) = σ( W^(l) * Σ_[j ∈ N(i) ∪ {i}] (1 / √(d_i * d_j)) * h_j^(l) )</w:t>
+      </w:r>
+      <w:r/>
+    </w:p>
+    <w:p>
+      <w:pPr>
+        <w:pStyle w:val="ListNumber"/>
+        <w:spacing w:after="60"/>
+      </w:pPr>
+      <w:r/>
+      <w:r>
+        <w:rPr>
+          <w:b/>
+        </w:rPr>
+        <w:t>Spectral Identification:</w:t>
+      </w:r>
+      <w:r>
+        <w:t xml:space="preserve"> We compare mass spectra at resolved peak apexes against libraries using Cosine similarity:</w:t>
+      </w:r>
+    </w:p>
+    <w:p>
+      <w:pPr>
+        <w:spacing w:after="120" w:line="276" w:lineRule="auto"/>
+      </w:pPr>
+      <w:r/>
+      <w:r>
+        <w:t>S_C = (u · v) / (||u|| * ||v||)</w:t>
+      </w:r>
+      <w:r/>
+    </w:p>
+    <w:p>
+      <w:pPr>
+        <w:spacing w:after="120" w:line="276" w:lineRule="auto"/>
+      </w:pPr>
+      <w:r>
+        <w:t xml:space="preserve">If local matches are below 0.7, the pipeline queries OpenRouter APIs via a LiteLLM proxy. It also looks for diagnostic fragments (like </w:t>
+      </w:r>
+      <w:r>
+        <w:t>m/z</w:t>
+      </w:r>
+      <w:r>
+        <w:t xml:space="preserve"> 73 and 147 for TMS derivatization) to tag compound names.</w:t>
+      </w:r>
+    </w:p>
+    <w:p>
+      <w:pPr>
+        <w:pStyle w:val="ListNumber"/>
+        <w:spacing w:after="60"/>
+      </w:pPr>
+      <w:r/>
+      <w:r>
+        <w:rPr>
+          <w:b/>
+        </w:rPr>
+        <w:t>FAIR Data Storage:</w:t>
+      </w:r>
+      <w:r>
+        <w:t xml:space="preserve"> We structure peak tables with Polars and save them as compressed Zarr v3 arrays. We log data lineage and tracking UIDs in a local SQLite-backed LaminDB instance.</w:t>
+      </w:r>
+    </w:p>
+    <w:p>
+      <w:pPr>
+        <w:pStyle w:val="Heading3"/>
+        <w:spacing w:before="240" w:after="120"/>
+      </w:pPr>
+      <w:r>
+        <w:rPr>
+          <w:rFonts w:ascii="Arial" w:hAnsi="Arial"/>
+          <w:b/>
+          <w:color w:val="333333"/>
+          <w:sz w:val="24"/>
+        </w:rPr>
+        <w:t>2.2 Comparison with Related Heuristics</w:t>
+      </w:r>
+    </w:p>
+    <w:p>
+      <w:pPr>
+        <w:spacing w:after="120" w:line="276" w:lineRule="auto"/>
+      </w:pPr>
+      <w:r/>
+      <w:r>
+        <w:rPr>
+          <w:rFonts w:ascii="Consolas" w:hAnsi="Consolas"/>
+        </w:rPr>
+        <w:t>CHROMA-AGENT-ALPHA</w:t>
+      </w:r>
+      <w:r>
+        <w:t xml:space="preserve"> shares core data structures with standard tools but changes how they are run:</w:t>
       </w:r>
     </w:p>
     <w:p>
@@ -554,12 +935,30 @@
       <w:r/>
       <w:r>
         <w:rPr>
-          <w:i/>
+          <w:b/>
         </w:rPr>
-        <w:t>Theoretical Plate Count (N):</w:t>
-      </w:r>
-      <w:r>
-        <w:t xml:space="preserve"> Evaluated at 50% peak height: N = 5.54 (tR / W_{0.5})^2.</w:t>
+        <w:t>Similarities:</w:t>
+      </w:r>
+      <w:r>
+        <w:t xml:space="preserve"> Like pyOpenMS, we use </w:t>
+      </w:r>
+      <w:r>
+        <w:rPr>
+          <w:rFonts w:ascii="Consolas" w:hAnsi="Consolas"/>
+        </w:rPr>
+        <w:t>.mzML</w:t>
+      </w:r>
+      <w:r>
+        <w:t xml:space="preserve"> files to represent multi-dimensional mass spec scans. We use ALS baseline correction and Cosine similarity matching, which are mathematically identical to standard algorithms in PyBaselines and </w:t>
+      </w:r>
+      <w:r>
+        <w:rPr>
+          <w:rFonts w:ascii="Consolas" w:hAnsi="Consolas"/>
+        </w:rPr>
+        <w:t>matchms</w:t>
+      </w:r>
+      <w:r>
+        <w:t>.</w:t>
       </w:r>
     </w:p>
     <w:p>
@@ -570,30 +969,101 @@
       <w:r/>
       <w:r>
         <w:rPr>
-          <w:i/>
+          <w:b/>
         </w:rPr>
-        <w:t>USP Peak Resolution (Rs):</w:t>
-      </w:r>
-      <w:r>
-        <w:t xml:space="preserve"> Evaluated between adjacent peaks: Rs = 2(t</w:t>
-      </w:r>
+        <w:t>Differences:</w:t>
+      </w:r>
+      <w:r>
+        <w:t xml:space="preserve"> Unlike PeakDetective (which requires GPU acceleration for convolutional models), our Graph Convolutional Network runs on a standard laptop CPU in under 30 seconds. Additionally, we use a tiered API router to keep total costs under ₹500/month, and we automatically serialize coordinates to Zarr v3 and LaminDB SQLite out-of-the-box.</w:t>
+      </w:r>
+    </w:p>
+    <w:p>
+      <w:pPr>
+        <w:pStyle w:val="Heading3"/>
+        <w:spacing w:before="240" w:after="120"/>
+      </w:pPr>
       <w:r>
         <w:rPr>
-          <w:i/>
+          <w:rFonts w:ascii="Arial" w:hAnsi="Arial"/>
+          <w:b/>
+          <w:color w:val="333333"/>
+          <w:sz w:val="24"/>
         </w:rPr>
-        <w:t>{R2} - t</w:t>
-      </w:r>
-      <w:r>
-        <w:t>{R1}) / (w</w:t>
+        <w:t>2.3 USP &lt;467&gt; Residual Solvents Calculations</w:t>
+      </w:r>
+    </w:p>
+    <w:p>
+      <w:pPr>
+        <w:spacing w:after="120" w:line="276" w:lineRule="auto"/>
+      </w:pPr>
+      <w:r>
+        <w:t>To check residual solvents in active pharmaceutical ingredients, the pipeline calculates concentrations in parts-per-million (</w:t>
+      </w:r>
+      <w:r>
+        <w:t>ppm</w:t>
+      </w:r>
+      <w:r>
+        <w:t>) following USP &lt;467&gt; guidelines:</w:t>
+      </w:r>
+    </w:p>
+    <w:p>
+      <w:pPr>
+        <w:spacing w:after="120" w:line="276" w:lineRule="auto"/>
+      </w:pPr>
+      <w:r/>
+      <w:r>
+        <w:t>Response Factor = A_std / C_std</w:t>
+      </w:r>
+      <w:r/>
+    </w:p>
+    <w:p>
+      <w:pPr>
+        <w:spacing w:after="120" w:line="276" w:lineRule="auto"/>
+      </w:pPr>
+      <w:r/>
+      <w:r>
+        <w:t>Concentration (ppm) = A_sample / (Response Factor * Sample Weight)</w:t>
+      </w:r>
+      <w:r/>
+    </w:p>
+    <w:p>
+      <w:pPr>
+        <w:spacing w:after="120" w:line="276" w:lineRule="auto"/>
+      </w:pPr>
+      <w:r>
+        <w:t xml:space="preserve">We compare the output concentrations against Class 1 and Class 2 toxicity limits (such as Benzene: 2 ppm, Toluene: 890 ppm). If a solvent exceeds these limits, the dashboard flags the run as </w:t>
       </w:r>
       <w:r>
         <w:rPr>
-          <w:i/>
+          <w:rFonts w:ascii="Consolas" w:hAnsi="Consolas"/>
         </w:rPr>
-        <w:t>1 + w</w:t>
-      </w:r>
-      <w:r>
-        <w:t>2).</w:t>
+        <w:t>FAIL</w:t>
+      </w:r>
+      <w:r>
+        <w:t>.</w:t>
+      </w:r>
+    </w:p>
+    <w:p>
+      <w:pPr>
+        <w:pStyle w:val="Heading3"/>
+        <w:spacing w:before="240" w:after="120"/>
+      </w:pPr>
+      <w:r>
+        <w:rPr>
+          <w:rFonts w:ascii="Arial" w:hAnsi="Arial"/>
+          <w:b/>
+          <w:color w:val="333333"/>
+          <w:sz w:val="24"/>
+        </w:rPr>
+        <w:t>2.4 Multi-Tier API Routing</w:t>
+      </w:r>
+    </w:p>
+    <w:p>
+      <w:pPr>
+        <w:spacing w:after="120" w:line="276" w:lineRule="auto"/>
+      </w:pPr>
+      <w:r>
+        <w:t>To keep API costs under ₹500/month, a custom LiteLLM proxy splits tasks:</w:t>
       </w:r>
     </w:p>
     <w:p>
@@ -604,293 +1074,12 @@
       <w:r/>
       <w:r>
         <w:rPr>
-          <w:i/>
-        </w:rPr>
-        <w:t>Signal-to-Noise Ratio (S/N):</w:t>
-      </w:r>
-      <w:r>
-        <w:t xml:space="preserve"> Calculates baseline noise standard deviation from signal points outside of all peak regions.</w:t>
-      </w:r>
-    </w:p>
-    <w:p>
-      <w:pPr>
-        <w:spacing w:after="120" w:line="276" w:lineRule="auto"/>
-      </w:pPr>
-      <w:r>
-        <w:t>Once validated, peak areas are integrated using the trapezoidal rule:</w:t>
-      </w:r>
-    </w:p>
-    <w:p>
-      <w:pPr>
-        <w:spacing w:after="120" w:line="276" w:lineRule="auto"/>
-      </w:pPr>
-      <w:r>
-        <w:t>A = Σ [ (y</w:t>
-      </w:r>
-      <w:r>
-        <w:rPr>
-          <w:i/>
-        </w:rPr>
-        <w:t>(i-1) + y</w:t>
-      </w:r>
-      <w:r>
-        <w:t>i) / 2 ] * (x</w:t>
-      </w:r>
-      <w:r>
-        <w:rPr>
-          <w:i/>
-        </w:rPr>
-        <w:t>i - x</w:t>
-      </w:r>
-      <w:r>
-        <w:t>(i-1))</w:t>
-      </w:r>
-    </w:p>
-    <w:p>
-      <w:pPr>
-        <w:spacing w:after="120" w:line="276" w:lineRule="auto"/>
-      </w:pPr>
-      <w:r>
-        <w:t>We set strict bounds to ensure we don't end up with negative areas.</w:t>
-      </w:r>
-    </w:p>
-    <w:p>
-      <w:pPr>
-        <w:pStyle w:val="ListNumber"/>
-        <w:spacing w:after="60"/>
-      </w:pPr>
-      <w:r/>
-      <w:r>
-        <w:rPr>
           <w:b/>
         </w:rPr>
-        <w:t>GNN-Based Peak Deconvolution &amp; Hybrid Curve Fitting:</w:t>
-      </w:r>
-      <w:r>
-        <w:t xml:space="preserve"> Standard integration methods fail when peaks overlap, double-counting the shared signal area. We solve this by building a 1D temporal-spectral graph G = (V, E) for each co-eluting region where scan steps are nodes v</w:t>
-      </w:r>
-      <w:r>
-        <w:rPr>
-          <w:i/>
-        </w:rPr>
-        <w:t>i ∈ V and edges e</w:t>
-      </w:r>
-      <w:r>
-        <w:t>{ij} ∈ E connect adjacent time points.</w:t>
-      </w:r>
-    </w:p>
-    <w:p>
-      <w:pPr>
-        <w:spacing w:after="120" w:line="276" w:lineRule="auto"/>
-      </w:pPr>
-      <w:r>
-        <w:t xml:space="preserve">We introduce </w:t>
-      </w:r>
-      <w:r>
-        <w:rPr>
-          <w:b/>
-        </w:rPr>
-        <w:t>Adaptive GNN Thresholding</w:t>
-      </w:r>
-      <w:r>
-        <w:t xml:space="preserve"> to dynamically optimize the GCN graph connectivity parameter (temporal proximity threshold θ_p) based on local peak density, widths, and spectral similarity:</w:t>
-      </w:r>
-    </w:p>
-    <w:p>
-      <w:pPr>
-        <w:spacing w:after="120" w:line="276" w:lineRule="auto"/>
-      </w:pPr>
-      <w:r>
-        <w:t>θ</w:t>
-      </w:r>
-      <w:r>
-        <w:rPr>
-          <w:i/>
-        </w:rPr>
-        <w:t>p = clip( W</w:t>
-      </w:r>
-      <w:r>
-        <w:t>norm × 1.5 × (1 / √K) × (1 - 0.25 * C_avg), 0.1, 0.7 )</w:t>
-      </w:r>
-    </w:p>
-    <w:p>
-      <w:pPr>
-        <w:spacing w:after="120" w:line="276" w:lineRule="auto"/>
-      </w:pPr>
-      <w:r>
-        <w:t>where W</w:t>
-      </w:r>
-      <w:r>
-        <w:rPr>
-          <w:i/>
-        </w:rPr>
-        <w:t>norm is the average normalized peak width, K is the number of co-eluting peaks, and C</w:t>
-      </w:r>
-      <w:r>
-        <w:t>avg is the average pairwise spectral cosine similarity between peak apexes. This prevents graph over-smoothing in dense or highly-correlated clusters.</w:t>
-      </w:r>
-    </w:p>
-    <w:p>
-      <w:pPr>
-        <w:spacing w:after="120" w:line="276" w:lineRule="auto"/>
-      </w:pPr>
-      <w:r>
-        <w:t xml:space="preserve">A two-layer Graph Convolutional Network (GCN) classifies the nodes and predicts component purity scores. Using these GCN priors, the system fits an </w:t>
-      </w:r>
-      <w:r>
-        <w:rPr>
-          <w:b/>
-        </w:rPr>
-        <w:t>Exponentially Modified Gaussian (EMG)</w:t>
-      </w:r>
-      <w:r>
-        <w:t xml:space="preserve"> curve model to the peaks via non-linear optimization:</w:t>
-      </w:r>
-    </w:p>
-    <w:p>
-      <w:pPr>
-        <w:spacing w:after="120" w:line="276" w:lineRule="auto"/>
-      </w:pPr>
-      <w:r>
-        <w:t>f(t; h, t</w:t>
-      </w:r>
-      <w:r>
-        <w:rPr>
-          <w:i/>
-        </w:rPr>
-        <w:t>R, σ, τ) = h * (σ/τ) * √(π/2) * exp( σ²/(2τ²) - (t - t</w:t>
-      </w:r>
-      <w:r>
-        <w:t xml:space="preserve">R)/τ ) </w:t>
-      </w:r>
-      <w:r>
-        <w:rPr>
-          <w:i/>
-        </w:rPr>
-        <w:t xml:space="preserve"> erfc( σ/(√2 </w:t>
-      </w:r>
-      <w:r>
-        <w:t xml:space="preserve"> τ) - (t - t_R)/(√2 * σ) )</w:t>
-      </w:r>
-    </w:p>
-    <w:p>
-      <w:pPr>
-        <w:spacing w:after="120" w:line="276" w:lineRule="auto"/>
-      </w:pPr>
-      <w:r>
-        <w:t>where h is height, tR is retention time, σ is Gaussian width, and τ is exponential relaxation time. To prevent CPU hangs on large clusters (K &gt; 5), a fallback mechanism automatically skips non-linear curve fitting and resolves areas directly from fast GCN node class probabilities.</w:t>
-      </w:r>
-    </w:p>
-    <w:p>
-      <w:pPr>
-        <w:spacing w:after="120" w:line="276" w:lineRule="auto"/>
-      </w:pPr>
-      <w:r>
-        <w:t>The GCN classification is calculated as:</w:t>
-      </w:r>
-    </w:p>
-    <w:p>
-      <w:pPr>
-        <w:spacing w:after="120" w:line="276" w:lineRule="auto"/>
-      </w:pPr>
-      <w:r>
-        <w:t>h</w:t>
-      </w:r>
-      <w:r>
-        <w:rPr>
-          <w:i/>
-        </w:rPr>
-        <w:t>i^(l+1) = σ( W^(l) * Σ</w:t>
-      </w:r>
-      <w:r>
-        <w:t>[j ∈ N(i) ∪ {i}] (1 / √(d</w:t>
-      </w:r>
-      <w:r>
-        <w:rPr>
-          <w:i/>
-        </w:rPr>
-        <w:t>i * d</w:t>
-      </w:r>
-      <w:r>
-        <w:t>j)) * h_j^(l) )</w:t>
-      </w:r>
-    </w:p>
-    <w:p>
-      <w:pPr>
-        <w:pStyle w:val="ListNumber"/>
-        <w:spacing w:after="60"/>
-      </w:pPr>
-      <w:r/>
-      <w:r>
-        <w:rPr>
-          <w:b/>
-        </w:rPr>
-        <w:t>Spectral Identification:</w:t>
-      </w:r>
-      <w:r>
-        <w:t xml:space="preserve"> We compare mass spectra at resolved peak apexes against libraries using Cosine similarity:</w:t>
-      </w:r>
-    </w:p>
-    <w:p>
-      <w:pPr>
-        <w:spacing w:after="120" w:line="276" w:lineRule="auto"/>
-      </w:pPr>
-      <w:r>
-        <w:t>S_C = (u · v) / (||u|| * ||v||)</w:t>
-      </w:r>
-    </w:p>
-    <w:p>
-      <w:pPr>
-        <w:spacing w:after="120" w:line="276" w:lineRule="auto"/>
-      </w:pPr>
-      <w:r>
-        <w:t>If local matches are below 0.7, the pipeline queries OpenRouter APIs via a LiteLLM proxy. It also looks for diagnostic fragments (like m/z 73 and 147 for TMS derivatization) to tag compound names.</w:t>
-      </w:r>
-    </w:p>
-    <w:p>
-      <w:pPr>
-        <w:pStyle w:val="ListNumber"/>
-        <w:spacing w:after="60"/>
-      </w:pPr>
-      <w:r/>
-      <w:r>
-        <w:rPr>
-          <w:b/>
-        </w:rPr>
-        <w:t>FAIR Data Storage:</w:t>
-      </w:r>
-      <w:r>
-        <w:t xml:space="preserve"> We structure peak tables with Polars and save them as compressed Zarr v3 arrays. We log data lineage and tracking UIDs in a local SQLite-backed LaminDB instance.</w:t>
-      </w:r>
-    </w:p>
-    <w:p>
-      <w:pPr>
-        <w:pStyle w:val="Heading3"/>
-        <w:spacing w:before="240" w:after="120"/>
-      </w:pPr>
-      <w:r>
-        <w:rPr>
-          <w:rFonts w:ascii="Arial" w:hAnsi="Arial"/>
-          <w:b/>
-          <w:color w:val="333333"/>
-          <w:sz w:val="24"/>
-        </w:rPr>
-        <w:t>2.2 Comparison with Related Heuristics</w:t>
-      </w:r>
-    </w:p>
-    <w:p>
-      <w:pPr>
-        <w:spacing w:after="120" w:line="276" w:lineRule="auto"/>
-      </w:pPr>
-      <w:r/>
-      <w:r>
-        <w:rPr>
-          <w:rFonts w:ascii="Consolas" w:hAnsi="Consolas"/>
-        </w:rPr>
-        <w:t>CHROMA-AGENT-ALPHA</w:t>
-      </w:r>
-      <w:r>
-        <w:t xml:space="preserve"> shares core data structures with standard tools but changes how they are run:</w:t>
+        <w:t>Tier 1 (Scout):</w:t>
+      </w:r>
+      <w:r>
+        <w:t xml:space="preserve"> Gemini 2.5 Flash Lite handles fast tasks like JSON validation.</w:t>
       </w:r>
     </w:p>
     <w:p>
@@ -903,28 +1092,10 @@
         <w:rPr>
           <w:b/>
         </w:rPr>
-        <w:t>Similarities:</w:t>
-      </w:r>
-      <w:r>
-        <w:t xml:space="preserve"> Like pyOpenMS, we use </w:t>
-      </w:r>
-      <w:r>
-        <w:rPr>
-          <w:rFonts w:ascii="Consolas" w:hAnsi="Consolas"/>
-        </w:rPr>
-        <w:t>.mzML</w:t>
-      </w:r>
-      <w:r>
-        <w:t xml:space="preserve"> files to represent multi-dimensional mass spec scans. We use ALS baseline correction and Cosine similarity matching, which are mathematically identical to standard algorithms in PyBaselines and </w:t>
-      </w:r>
-      <w:r>
-        <w:rPr>
-          <w:rFonts w:ascii="Consolas" w:hAnsi="Consolas"/>
-        </w:rPr>
-        <w:t>matchms</w:t>
-      </w:r>
-      <w:r>
-        <w:t>.</w:t>
+        <w:t>Tier 2 (Analyst):</w:t>
+      </w:r>
+      <w:r>
+        <w:t xml:space="preserve"> DeepSeek V4 Flash (free tier) handles memory summaries.</w:t>
       </w:r>
     </w:p>
     <w:p>
@@ -937,98 +1108,10 @@
         <w:rPr>
           <w:b/>
         </w:rPr>
-        <w:t>Differences:</w:t>
-      </w:r>
-      <w:r>
-        <w:t xml:space="preserve"> Unlike PeakDetective (which requires GPU acceleration for convolutional models), our Graph Convolutional Network runs on a standard laptop CPU in under 30 seconds. Additionally, we use a tiered API router to keep total costs under ₹500/month, and we automatically serialize coordinates to Zarr v3 and LaminDB SQLite out-of-the-box.</w:t>
-      </w:r>
-    </w:p>
-    <w:p>
-      <w:pPr>
-        <w:pStyle w:val="Heading3"/>
-        <w:spacing w:before="240" w:after="120"/>
-      </w:pPr>
-      <w:r>
-        <w:rPr>
-          <w:rFonts w:ascii="Arial" w:hAnsi="Arial"/>
-          <w:b/>
-          <w:color w:val="333333"/>
-          <w:sz w:val="24"/>
-        </w:rPr>
-        <w:t>2.3 USP &lt;467&gt; Residual Solvents Calculations</w:t>
-      </w:r>
-    </w:p>
-    <w:p>
-      <w:pPr>
-        <w:spacing w:after="120" w:line="276" w:lineRule="auto"/>
-      </w:pPr>
-      <w:r>
-        <w:t>To check residual solvents in active pharmaceutical ingredients, the pipeline calculates concentrations in parts-per-million (ppm) following USP &lt;467&gt; guidelines:</w:t>
-      </w:r>
-    </w:p>
-    <w:p>
-      <w:pPr>
-        <w:spacing w:after="120" w:line="276" w:lineRule="auto"/>
-      </w:pPr>
-      <w:r>
-        <w:t>Response Factor = A</w:t>
-      </w:r>
-      <w:r>
-        <w:rPr>
-          <w:i/>
-        </w:rPr>
-        <w:t>std / C</w:t>
-      </w:r>
-      <w:r>
-        <w:t>std</w:t>
-      </w:r>
-    </w:p>
-    <w:p>
-      <w:pPr>
-        <w:spacing w:after="120" w:line="276" w:lineRule="auto"/>
-      </w:pPr>
-      <w:r>
-        <w:t>Concentration (ppm) = A_sample / (Response Factor * Sample Weight)</w:t>
-      </w:r>
-    </w:p>
-    <w:p>
-      <w:pPr>
-        <w:spacing w:after="120" w:line="276" w:lineRule="auto"/>
-      </w:pPr>
-      <w:r>
-        <w:t xml:space="preserve">We compare the output concentrations against Class 1 and Class 2 toxicity limits (such as Benzene: 2 ppm, Toluene: 890 ppm). If a solvent exceeds these limits, the dashboard flags the run as </w:t>
-      </w:r>
-      <w:r>
-        <w:rPr>
-          <w:rFonts w:ascii="Consolas" w:hAnsi="Consolas"/>
-        </w:rPr>
-        <w:t>FAIL</w:t>
-      </w:r>
-      <w:r>
-        <w:t>.</w:t>
-      </w:r>
-    </w:p>
-    <w:p>
-      <w:pPr>
-        <w:pStyle w:val="Heading3"/>
-        <w:spacing w:before="240" w:after="120"/>
-      </w:pPr>
-      <w:r>
-        <w:rPr>
-          <w:rFonts w:ascii="Arial" w:hAnsi="Arial"/>
-          <w:b/>
-          <w:color w:val="333333"/>
-          <w:sz w:val="24"/>
-        </w:rPr>
-        <w:t>2.4 Multi-Tier API Routing</w:t>
-      </w:r>
-    </w:p>
-    <w:p>
-      <w:pPr>
-        <w:spacing w:after="120" w:line="276" w:lineRule="auto"/>
-      </w:pPr>
-      <w:r>
-        <w:t>To keep API costs under ₹500/month, a custom LiteLLM proxy splits tasks:</w:t>
+        <w:t>Tier 3 (Architect):</w:t>
+      </w:r>
+      <w:r>
+        <w:t xml:space="preserve"> DeepSeek V4 Flash (paid tier) writes the code.</w:t>
       </w:r>
     </w:p>
     <w:p>
@@ -1041,10 +1124,10 @@
         <w:rPr>
           <w:b/>
         </w:rPr>
-        <w:t>Tier 1 (Scout):</w:t>
-      </w:r>
-      <w:r>
-        <w:t xml:space="preserve"> Gemini 2.5 Flash Lite handles fast tasks like JSON validation.</w:t>
+        <w:t>Tier 3-CoT:</w:t>
+      </w:r>
+      <w:r>
+        <w:t xml:space="preserve"> DeepSeek R1 Qwen (32B) handles math and GNN reasoning.</w:t>
       </w:r>
     </w:p>
     <w:p>
@@ -1057,10 +1140,83 @@
         <w:rPr>
           <w:b/>
         </w:rPr>
-        <w:t>Tier 2 (Analyst):</w:t>
-      </w:r>
-      <w:r>
-        <w:t xml:space="preserve"> DeepSeek V4 Flash (free tier) handles memory summaries.</w:t>
+        <w:t>Tier 4 (Fallback):</w:t>
+      </w:r>
+      <w:r>
+        <w:t xml:space="preserve"> Connects to a local proxy on port 8080 if cloud endpoints fail.</w:t>
+      </w:r>
+    </w:p>
+    <w:p>
+      <w:pPr>
+        <w:pStyle w:val="Heading3"/>
+        <w:spacing w:before="240" w:after="120"/>
+      </w:pPr>
+      <w:r>
+        <w:rPr>
+          <w:rFonts w:ascii="Arial" w:hAnsi="Arial"/>
+          <w:b/>
+          <w:color w:val="333333"/>
+          <w:sz w:val="24"/>
+        </w:rPr>
+        <w:t>2.5 Server Protection</w:t>
+      </w:r>
+    </w:p>
+    <w:p>
+      <w:pPr>
+        <w:spacing w:after="120" w:line="276" w:lineRule="auto"/>
+      </w:pPr>
+      <w:r>
+        <w:t>We secure the pipeline backend using basic authentication for fastapi routes and ngrok tunnels. Input sanitation prevents path traversal exploits by rejecting parent directory markers (</w:t>
+      </w:r>
+      <w:r>
+        <w:rPr>
+          <w:rFonts w:ascii="Consolas" w:hAnsi="Consolas"/>
+        </w:rPr>
+        <w:t>..</w:t>
+      </w:r>
+      <w:r>
+        <w:t xml:space="preserve">) in sample IDs, and we limit file uploads to </w:t>
+      </w:r>
+      <w:r>
+        <w:rPr>
+          <w:rFonts w:ascii="Consolas" w:hAnsi="Consolas"/>
+        </w:rPr>
+        <w:t>.cdf</w:t>
+      </w:r>
+      <w:r>
+        <w:t xml:space="preserve"> and </w:t>
+      </w:r>
+      <w:r>
+        <w:rPr>
+          <w:rFonts w:ascii="Consolas" w:hAnsi="Consolas"/>
+        </w:rPr>
+        <w:t>.mzML</w:t>
+      </w:r>
+      <w:r>
+        <w:t xml:space="preserve"> formats under 50 MB.</w:t>
+      </w:r>
+    </w:p>
+    <w:p>
+      <w:pPr>
+        <w:pStyle w:val="Heading3"/>
+        <w:spacing w:before="240" w:after="120"/>
+      </w:pPr>
+      <w:r>
+        <w:rPr>
+          <w:rFonts w:ascii="Arial" w:hAnsi="Arial"/>
+          <w:b/>
+          <w:color w:val="333333"/>
+          <w:sz w:val="24"/>
+        </w:rPr>
+        <w:t>2.6 Multi-Sample Chromatographic Alignment (RT Correction)</w:t>
+      </w:r>
+    </w:p>
+    <w:p>
+      <w:pPr>
+        <w:spacing w:after="120" w:line="276" w:lineRule="auto"/>
+      </w:pPr>
+      <w:r>
+        <w:t>To correct for retention time (RT) drift across multiple injections, the pipeline incorporates an alignment module based on Sakoe-Chiba constrained Dynamic Time Warping (DTW):</w:t>
       </w:r>
     </w:p>
     <w:p>
@@ -1071,12 +1227,21 @@
       <w:r/>
       <w:r>
         <w:rPr>
+          <w:i/>
+        </w:rPr>
+        <w:t>Downsampled Interpolation:</w:t>
+      </w:r>
+      <w:r>
+        <w:t xml:space="preserve"> Computing DTW over raw GC-MS telemetry signals (~18,000 scans) in pure Python is computationally prohibitive. The pipeline downsamples raw TIC/BPC signals to a regular 1000-point grid. This cuts computation time to </w:t>
+      </w:r>
+      <w:r>
+        <w:rPr>
           <w:b/>
         </w:rPr>
-        <w:t>Tier 3 (Architect):</w:t>
-      </w:r>
-      <w:r>
-        <w:t xml:space="preserve"> DeepSeek V4 Flash (paid tier) writes the code.</w:t>
+        <w:t>110ms</w:t>
+      </w:r>
+      <w:r>
+        <w:t xml:space="preserve"> (a 300x speedup), preventing API read timeouts, and shrinks data payloads by 96%.</w:t>
       </w:r>
     </w:p>
     <w:p>
@@ -1087,12 +1252,24 @@
       <w:r/>
       <w:r>
         <w:rPr>
-          <w:b/>
+          <w:i/>
         </w:rPr>
-        <w:t>Tier 3-CoT:</w:t>
-      </w:r>
-      <w:r>
-        <w:t xml:space="preserve"> DeepSeek R1 Qwen (32B) handles math and GNN reasoning.</w:t>
+        <w:t>Sakoe-Chiba Search Constraint:</w:t>
+      </w:r>
+      <w:r>
+        <w:t xml:space="preserve"> Warping paths are calculated within a diagonal constraint band (</w:t>
+      </w:r>
+      <w:r>
+        <w:t>w = 15.0</w:t>
+      </w:r>
+      <w:r>
+        <w:t xml:space="preserve"> seconds) to prevent non-physical warpings and keep matrix space complexity </w:t>
+      </w:r>
+      <w:r>
+        <w:t>O(N · w)</w:t>
+      </w:r>
+      <w:r>
+        <w:t>.</w:t>
       </w:r>
     </w:p>
     <w:p>
@@ -1103,136 +1280,6 @@
       <w:r/>
       <w:r>
         <w:rPr>
-          <w:b/>
-        </w:rPr>
-        <w:t>Tier 4 (Fallback):</w:t>
-      </w:r>
-      <w:r>
-        <w:t xml:space="preserve"> Connects to a local proxy on port 8080 if cloud endpoints fail.</w:t>
-      </w:r>
-    </w:p>
-    <w:p>
-      <w:pPr>
-        <w:pStyle w:val="Heading3"/>
-        <w:spacing w:before="240" w:after="120"/>
-      </w:pPr>
-      <w:r>
-        <w:rPr>
-          <w:rFonts w:ascii="Arial" w:hAnsi="Arial"/>
-          <w:b/>
-          <w:color w:val="333333"/>
-          <w:sz w:val="24"/>
-        </w:rPr>
-        <w:t>2.5 Server Protection</w:t>
-      </w:r>
-    </w:p>
-    <w:p>
-      <w:pPr>
-        <w:spacing w:after="120" w:line="276" w:lineRule="auto"/>
-      </w:pPr>
-      <w:r>
-        <w:t>We secure the pipeline backend using basic authentication for fastapi routes and ngrok tunnels. Input sanitation prevents path traversal exploits by rejecting parent directory markers (</w:t>
-      </w:r>
-      <w:r>
-        <w:rPr>
-          <w:rFonts w:ascii="Consolas" w:hAnsi="Consolas"/>
-        </w:rPr>
-        <w:t>..</w:t>
-      </w:r>
-      <w:r>
-        <w:t xml:space="preserve">) in sample IDs, and we limit file uploads to </w:t>
-      </w:r>
-      <w:r>
-        <w:rPr>
-          <w:rFonts w:ascii="Consolas" w:hAnsi="Consolas"/>
-        </w:rPr>
-        <w:t>.cdf</w:t>
-      </w:r>
-      <w:r>
-        <w:t xml:space="preserve"> and </w:t>
-      </w:r>
-      <w:r>
-        <w:rPr>
-          <w:rFonts w:ascii="Consolas" w:hAnsi="Consolas"/>
-        </w:rPr>
-        <w:t>.mzML</w:t>
-      </w:r>
-      <w:r>
-        <w:t xml:space="preserve"> formats under 50 MB.</w:t>
-      </w:r>
-    </w:p>
-    <w:p>
-      <w:pPr>
-        <w:pStyle w:val="Heading3"/>
-        <w:spacing w:before="240" w:after="120"/>
-      </w:pPr>
-      <w:r>
-        <w:rPr>
-          <w:rFonts w:ascii="Arial" w:hAnsi="Arial"/>
-          <w:b/>
-          <w:color w:val="333333"/>
-          <w:sz w:val="24"/>
-        </w:rPr>
-        <w:t>2.6 Multi-Sample Chromatographic Alignment (RT Correction)</w:t>
-      </w:r>
-    </w:p>
-    <w:p>
-      <w:pPr>
-        <w:spacing w:after="120" w:line="276" w:lineRule="auto"/>
-      </w:pPr>
-      <w:r>
-        <w:t>To correct for retention time (RT) drift across multiple injections, the pipeline incorporates an alignment module based on Sakoe-Chiba constrained Dynamic Time Warping (DTW):</w:t>
-      </w:r>
-    </w:p>
-    <w:p>
-      <w:pPr>
-        <w:pStyle w:val="ListBullet"/>
-        <w:spacing w:after="60"/>
-      </w:pPr>
-      <w:r/>
-      <w:r>
-        <w:rPr>
-          <w:i/>
-        </w:rPr>
-        <w:t>Downsampled Interpolation:</w:t>
-      </w:r>
-      <w:r>
-        <w:t xml:space="preserve"> Computing DTW over raw GC-MS telemetry signals (~18,000 scans) in pure Python is computationally prohibitive. The pipeline downsamples raw TIC/BPC signals to a regular 1000-point grid. This cuts computation time to </w:t>
-      </w:r>
-      <w:r>
-        <w:rPr>
-          <w:b/>
-        </w:rPr>
-        <w:t>110ms</w:t>
-      </w:r>
-      <w:r>
-        <w:t xml:space="preserve"> (a 300x speedup), preventing API read timeouts, and shrinks data payloads by 96%.</w:t>
-      </w:r>
-    </w:p>
-    <w:p>
-      <w:pPr>
-        <w:pStyle w:val="ListBullet"/>
-        <w:spacing w:after="60"/>
-      </w:pPr>
-      <w:r/>
-      <w:r>
-        <w:rPr>
-          <w:i/>
-        </w:rPr>
-        <w:t>Sakoe-Chiba Search Constraint:</w:t>
-      </w:r>
-      <w:r>
-        <w:t xml:space="preserve"> Warping paths are calculated within a diagonal constraint band (w = 15.0 seconds) to prevent non-physical warpings and keep matrix space complexity O(N · w).</w:t>
-      </w:r>
-    </w:p>
-    <w:p>
-      <w:pPr>
-        <w:pStyle w:val="ListBullet"/>
-        <w:spacing w:after="60"/>
-      </w:pPr>
-      <w:r/>
-      <w:r>
-        <w:rPr>
           <w:i/>
         </w:rPr>
         <w:t>Peak Apex Mapping:</w:t>
@@ -1311,7 +1358,13 @@
         <w:t>0xFFF</w:t>
       </w:r>
       <w:r>
-        <w:t>) for records with category index d ≥ 8. This resolved prior height-math overflow errors and scaled intensities correctly.</w:t>
+        <w:t xml:space="preserve">) for records with category index </w:t>
+      </w:r>
+      <w:r>
+        <w:t>d ≥ 8</w:t>
+      </w:r>
+      <w:r>
+        <w:t>. This resolved prior height-math overflow errors and scaled intensities correctly.</w:t>
       </w:r>
     </w:p>
     <w:p>

</xml_diff>

<commit_message>
docs: compile and fix math equations and hyperlinks in reports portfolio
</commit_message>
<xml_diff>
--- a/reports/SLAS_Technology_Manuscript_Draft.docx
+++ b/reports/SLAS_Technology_Manuscript_Draft.docx
@@ -33,11 +33,11 @@
       </w:r>
       <w:hyperlink r:id="rId9">
         <w:r>
-          <w:t>Devendra Kataria</w:t>
           <w:rPr>
             <w:color w:val="0000CC"/>
             <w:u w:val="single"/>
           </w:rPr>
+          <w:t xml:space="preserve">Devendra Kataria</w:t>
         </w:r>
       </w:hyperlink>
       <w:r/>
@@ -576,7 +576,7 @@
         <w:t xml:space="preserve">):* Evaluated at 5% peak height: </w:t>
       </w:r>
       <w:r>
-        <w:t>T = W_{0.05} / (2f)</w:t>
+        <w:t>T = W_0.05 / (2f)</w:t>
       </w:r>
       <w:r>
         <w:t xml:space="preserve"> with sub-point interpolation.</w:t>
@@ -597,7 +597,7 @@
         <w:t xml:space="preserve">):* Evaluated at 50% peak height: </w:t>
       </w:r>
       <w:r>
-        <w:t>N = 5.54 (tR / W_{0.5})^2</w:t>
+        <w:t>N = 5.54 (t_R / W_0.5)^2</w:t>
       </w:r>
       <w:r>
         <w:t>.</w:t>
@@ -612,13 +612,13 @@
         <w:t>*USP Peak Resolution (</w:t>
       </w:r>
       <w:r>
-        <w:t>Rs</w:t>
+        <w:t>R_s</w:t>
       </w:r>
       <w:r>
         <w:t xml:space="preserve">):* Evaluated between adjacent peaks: </w:t>
       </w:r>
       <w:r>
-        <w:t>Rs = 2(t_{R2} - t_{R1}) / (w_1 + w_2)</w:t>
+        <w:t>R_s = 2(t_R2 - t_R1) / (w_1 + w_2)</w:t>
       </w:r>
       <w:r>
         <w:t>.</w:t>
@@ -693,7 +693,7 @@
         <w:t xml:space="preserve"> and edges </w:t>
       </w:r>
       <w:r>
-        <w:t>e_{ij} ∈ E</w:t>
+        <w:t>e_ij ∈ E</w:t>
       </w:r>
       <w:r>
         <w:t xml:space="preserve"> connect adjacent time points.</w:t>
@@ -740,7 +740,7 @@
         <w:t xml:space="preserve">where </w:t>
       </w:r>
       <w:r>
-        <w:t>W_norm</w:t>
+        <w:t>W_bar_norm</w:t>
       </w:r>
       <w:r>
         <w:t xml:space="preserve"> is the average normalized peak width, </w:t>
@@ -799,7 +799,7 @@
         <w:t xml:space="preserve"> is height, </w:t>
       </w:r>
       <w:r>
-        <w:t>tR</w:t>
+        <w:t>t_R</w:t>
       </w:r>
       <w:r>
         <w:t xml:space="preserve"> is retention time, </w:t>

</xml_diff>

<commit_message>
docs: compile and integrate native Word equation objects for all math formulas
</commit_message>
<xml_diff>
--- a/reports/SLAS_Technology_Manuscript_Draft.docx
+++ b/reports/SLAS_Technology_Manuscript_Draft.docx
@@ -402,9 +402,30 @@
       <w:r>
         <w:t xml:space="preserve"> FID files. This parser automatically detects version signatures, decodes absolute starting values and 16-bit/32-bit delta-compressed integer streams, and scales intensities by the header's scaling factor without external runtime dependencies. It extracts retention times, intensity values, and </w:t>
       </w:r>
-      <w:r>
-        <w:t>m/z</w:t>
-      </w:r>
+      <m:oMath>
+        <m:box>
+          <m:e>
+            <m:r>
+              <m:rPr>
+                <m:sty m:val="i"/>
+              </m:rPr>
+              <m:t>m</m:t>
+            </m:r>
+            <m:r>
+              <m:rPr>
+                <m:sty m:val="p"/>
+              </m:rPr>
+              <m:t>/</m:t>
+            </m:r>
+            <m:r>
+              <m:rPr>
+                <m:sty m:val="i"/>
+              </m:rPr>
+              <m:t>z</m:t>
+            </m:r>
+          </m:e>
+        </m:box>
+      </m:oMath>
       <w:r>
         <w:t xml:space="preserve"> spectra directly into memory.</w:t>
       </w:r>
@@ -424,21 +445,244 @@
       <w:r>
         <w:t xml:space="preserve"> Column bleed and baseline drift can ruin peak calculations. We apply Asymmetric Least Squares (ALS) baseline correction. The corrected signal vector </w:t>
       </w:r>
-      <w:r>
-        <w:t>z</w:t>
-      </w:r>
+      <m:oMath>
+        <m:box>
+          <m:e>
+            <m:r>
+              <m:rPr>
+                <m:sty m:val="i"/>
+              </m:rPr>
+              <m:t>𝐳</m:t>
+            </m:r>
+          </m:e>
+        </m:box>
+      </m:oMath>
       <w:r>
         <w:t xml:space="preserve"> is computed by minimizing the penalized objective function:</w:t>
       </w:r>
     </w:p>
     <w:p>
       <w:pPr>
-        <w:spacing w:after="120" w:line="276" w:lineRule="auto"/>
+        <w:spacing w:after="240" w:line="276" w:lineRule="auto" w:before="120"/>
+        <w:jc w:val="center"/>
       </w:pPr>
       <w:r/>
-      <w:r>
-        <w:t>S = Σ w_i(y_i - z_i)² + λ Σ (Δ²z_i)²</w:t>
-      </w:r>
+      <m:oMath>
+        <m:box>
+          <m:e>
+            <m:r>
+              <m:rPr>
+                <m:sty m:val="i"/>
+              </m:rPr>
+              <m:t>S</m:t>
+            </m:r>
+            <m:r>
+              <m:rPr>
+                <m:sty m:val="p"/>
+              </m:rPr>
+              <m:t>=</m:t>
+            </m:r>
+            <m:nary>
+              <m:naryPr>
+                <m:chr m:val="∑"/>
+                <m:limLoc m:val="undOvr"/>
+              </m:naryPr>
+              <m:sub>
+                <m:box>
+                  <m:e>
+                    <m:r>
+                      <m:rPr>
+                        <m:sty m:val="i"/>
+                      </m:rPr>
+                      <m:t>i</m:t>
+                    </m:r>
+                  </m:e>
+                </m:box>
+              </m:sub>
+              <m:sup/>
+              <m:e>
+                <m:sSub>
+                  <m:e>
+                    <m:r>
+                      <m:rPr>
+                        <m:sty m:val="i"/>
+                      </m:rPr>
+                      <m:t>w</m:t>
+                    </m:r>
+                  </m:e>
+                  <m:sub>
+                    <m:r>
+                      <m:rPr>
+                        <m:sty m:val="i"/>
+                      </m:rPr>
+                      <m:t>i</m:t>
+                    </m:r>
+                  </m:sub>
+                </m:sSub>
+                <m:r>
+                  <m:rPr>
+                    <m:sty m:val="p"/>
+                  </m:rPr>
+                  <m:t>(</m:t>
+                </m:r>
+                <m:sSub>
+                  <m:e>
+                    <m:r>
+                      <m:rPr>
+                        <m:sty m:val="i"/>
+                      </m:rPr>
+                      <m:t>y</m:t>
+                    </m:r>
+                  </m:e>
+                  <m:sub>
+                    <m:r>
+                      <m:rPr>
+                        <m:sty m:val="i"/>
+                      </m:rPr>
+                      <m:t>i</m:t>
+                    </m:r>
+                  </m:sub>
+                </m:sSub>
+                <m:r>
+                  <m:rPr>
+                    <m:sty m:val="p"/>
+                  </m:rPr>
+                  <m:t>−</m:t>
+                </m:r>
+                <m:sSub>
+                  <m:e>
+                    <m:r>
+                      <m:rPr>
+                        <m:sty m:val="i"/>
+                      </m:rPr>
+                      <m:t>z</m:t>
+                    </m:r>
+                  </m:e>
+                  <m:sub>
+                    <m:r>
+                      <m:rPr>
+                        <m:sty m:val="i"/>
+                      </m:rPr>
+                      <m:t>i</m:t>
+                    </m:r>
+                  </m:sub>
+                </m:sSub>
+                <m:sSup>
+                  <m:e>
+                    <m:r>
+                      <m:rPr>
+                        <m:sty m:val="p"/>
+                      </m:rPr>
+                      <m:t>)</m:t>
+                    </m:r>
+                  </m:e>
+                  <m:sup>
+                    <m:r>
+                      <m:rPr>
+                        <m:sty m:val="p"/>
+                      </m:rPr>
+                      <m:t>2</m:t>
+                    </m:r>
+                  </m:sup>
+                </m:sSup>
+                <m:r>
+                  <m:rPr>
+                    <m:sty m:val="p"/>
+                  </m:rPr>
+                  <m:t>+</m:t>
+                </m:r>
+                <m:r>
+                  <m:rPr>
+                    <m:sty m:val="i"/>
+                  </m:rPr>
+                  <m:t>λ</m:t>
+                </m:r>
+                <m:nary>
+                  <m:naryPr>
+                    <m:chr m:val="∑"/>
+                    <m:limLoc m:val="undOvr"/>
+                  </m:naryPr>
+                  <m:sub>
+                    <m:box>
+                      <m:e>
+                        <m:r>
+                          <m:rPr>
+                            <m:sty m:val="i"/>
+                          </m:rPr>
+                          <m:t>i</m:t>
+                        </m:r>
+                      </m:e>
+                    </m:box>
+                  </m:sub>
+                  <m:sup/>
+                  <m:e>
+                    <m:r>
+                      <m:rPr>
+                        <m:sty m:val="p"/>
+                      </m:rPr>
+                      <m:t>(</m:t>
+                    </m:r>
+                    <m:sSup>
+                      <m:e>
+                        <m:r>
+                          <m:rPr>
+                            <m:sty m:val="i"/>
+                          </m:rPr>
+                          <m:t>Δ</m:t>
+                        </m:r>
+                      </m:e>
+                      <m:sup>
+                        <m:r>
+                          <m:rPr>
+                            <m:sty m:val="p"/>
+                          </m:rPr>
+                          <m:t>2</m:t>
+                        </m:r>
+                      </m:sup>
+                    </m:sSup>
+                    <m:sSub>
+                      <m:e>
+                        <m:r>
+                          <m:rPr>
+                            <m:sty m:val="i"/>
+                          </m:rPr>
+                          <m:t>z</m:t>
+                        </m:r>
+                      </m:e>
+                      <m:sub>
+                        <m:r>
+                          <m:rPr>
+                            <m:sty m:val="i"/>
+                          </m:rPr>
+                          <m:t>i</m:t>
+                        </m:r>
+                      </m:sub>
+                    </m:sSub>
+                    <m:sSup>
+                      <m:e>
+                        <m:r>
+                          <m:rPr>
+                            <m:sty m:val="p"/>
+                          </m:rPr>
+                          <m:t>)</m:t>
+                        </m:r>
+                      </m:e>
+                      <m:sup>
+                        <m:r>
+                          <m:rPr>
+                            <m:sty m:val="p"/>
+                          </m:rPr>
+                          <m:t>2</m:t>
+                        </m:r>
+                      </m:sup>
+                    </m:sSup>
+                  </m:e>
+                </m:nary>
+              </m:e>
+            </m:nary>
+          </m:e>
+        </m:box>
+      </m:oMath>
       <w:r/>
     </w:p>
     <w:p>
@@ -448,57 +692,386 @@
       <w:r>
         <w:t xml:space="preserve">where </w:t>
       </w:r>
-      <w:r>
-        <w:t>y_i</w:t>
-      </w:r>
+      <m:oMath>
+        <m:box>
+          <m:e>
+            <m:sSub>
+              <m:e>
+                <m:r>
+                  <m:rPr>
+                    <m:sty m:val="i"/>
+                  </m:rPr>
+                  <m:t>y</m:t>
+                </m:r>
+              </m:e>
+              <m:sub>
+                <m:r>
+                  <m:rPr>
+                    <m:sty m:val="i"/>
+                  </m:rPr>
+                  <m:t>i</m:t>
+                </m:r>
+              </m:sub>
+            </m:sSub>
+          </m:e>
+        </m:box>
+      </m:oMath>
       <w:r>
         <w:t xml:space="preserve"> is the raw intensity, </w:t>
       </w:r>
-      <w:r>
-        <w:t>z_i</w:t>
-      </w:r>
+      <m:oMath>
+        <m:box>
+          <m:e>
+            <m:sSub>
+              <m:e>
+                <m:r>
+                  <m:rPr>
+                    <m:sty m:val="i"/>
+                  </m:rPr>
+                  <m:t>z</m:t>
+                </m:r>
+              </m:e>
+              <m:sub>
+                <m:r>
+                  <m:rPr>
+                    <m:sty m:val="i"/>
+                  </m:rPr>
+                  <m:t>i</m:t>
+                </m:r>
+              </m:sub>
+            </m:sSub>
+          </m:e>
+        </m:box>
+      </m:oMath>
       <w:r>
         <w:t xml:space="preserve"> is the baseline, </w:t>
       </w:r>
-      <w:r>
-        <w:t>Δ^2</w:t>
-      </w:r>
+      <m:oMath>
+        <m:box>
+          <m:e>
+            <m:sSup>
+              <m:e>
+                <m:r>
+                  <m:rPr>
+                    <m:sty m:val="i"/>
+                  </m:rPr>
+                  <m:t>Δ</m:t>
+                </m:r>
+              </m:e>
+              <m:sup>
+                <m:r>
+                  <m:rPr>
+                    <m:sty m:val="p"/>
+                  </m:rPr>
+                  <m:t>2</m:t>
+                </m:r>
+              </m:sup>
+            </m:sSup>
+          </m:e>
+        </m:box>
+      </m:oMath>
       <w:r>
         <w:t xml:space="preserve"> is the second-order difference operator, and </w:t>
       </w:r>
-      <w:r>
-        <w:t>λ</w:t>
-      </w:r>
+      <m:oMath>
+        <m:box>
+          <m:e>
+            <m:r>
+              <m:rPr>
+                <m:sty m:val="i"/>
+              </m:rPr>
+              <m:t>λ</m:t>
+            </m:r>
+          </m:e>
+        </m:box>
+      </m:oMath>
       <w:r>
         <w:t xml:space="preserve"> is a smoothness parameter (set between </w:t>
       </w:r>
-      <w:r>
-        <w:t>10^3</w:t>
-      </w:r>
+      <m:oMath>
+        <m:box>
+          <m:e>
+            <m:sSup>
+              <m:e>
+                <m:r>
+                  <m:rPr>
+                    <m:sty m:val="p"/>
+                  </m:rPr>
+                  <m:t>10</m:t>
+                </m:r>
+              </m:e>
+              <m:sup>
+                <m:r>
+                  <m:rPr>
+                    <m:sty m:val="p"/>
+                  </m:rPr>
+                  <m:t>3</m:t>
+                </m:r>
+              </m:sup>
+            </m:sSup>
+          </m:e>
+        </m:box>
+      </m:oMath>
       <w:r>
         <w:t xml:space="preserve"> and </w:t>
       </w:r>
-      <w:r>
-        <w:t>10^6</w:t>
-      </w:r>
+      <m:oMath>
+        <m:box>
+          <m:e>
+            <m:sSup>
+              <m:e>
+                <m:r>
+                  <m:rPr>
+                    <m:sty m:val="p"/>
+                  </m:rPr>
+                  <m:t>10</m:t>
+                </m:r>
+              </m:e>
+              <m:sup>
+                <m:r>
+                  <m:rPr>
+                    <m:sty m:val="p"/>
+                  </m:rPr>
+                  <m:t>6</m:t>
+                </m:r>
+              </m:sup>
+            </m:sSup>
+          </m:e>
+        </m:box>
+      </m:oMath>
       <w:r>
         <w:t xml:space="preserve">). The asymmetric weights </w:t>
       </w:r>
-      <w:r>
-        <w:t>w_i</w:t>
-      </w:r>
+      <m:oMath>
+        <m:box>
+          <m:e>
+            <m:sSub>
+              <m:e>
+                <m:r>
+                  <m:rPr>
+                    <m:sty m:val="i"/>
+                  </m:rPr>
+                  <m:t>w</m:t>
+                </m:r>
+              </m:e>
+              <m:sub>
+                <m:r>
+                  <m:rPr>
+                    <m:sty m:val="i"/>
+                  </m:rPr>
+                  <m:t>i</m:t>
+                </m:r>
+              </m:sub>
+            </m:sSub>
+          </m:e>
+        </m:box>
+      </m:oMath>
       <w:r>
         <w:t xml:space="preserve"> are:</w:t>
       </w:r>
     </w:p>
     <w:p>
       <w:pPr>
-        <w:spacing w:after="120" w:line="276" w:lineRule="auto"/>
+        <w:spacing w:after="240" w:line="276" w:lineRule="auto" w:before="120"/>
+        <w:jc w:val="center"/>
       </w:pPr>
       <w:r/>
-      <w:r>
-        <w:t>w_i = p if y_i &gt; z_i, or 1-p if y_i ≤ z_i</w:t>
-      </w:r>
+      <m:oMath>
+        <m:box>
+          <m:e>
+            <m:sSub>
+              <m:e>
+                <m:r>
+                  <m:rPr>
+                    <m:sty m:val="i"/>
+                  </m:rPr>
+                  <m:t>w</m:t>
+                </m:r>
+              </m:e>
+              <m:sub>
+                <m:r>
+                  <m:rPr>
+                    <m:sty m:val="i"/>
+                  </m:rPr>
+                  <m:t>i</m:t>
+                </m:r>
+              </m:sub>
+            </m:sSub>
+            <m:r>
+              <m:rPr>
+                <m:sty m:val="p"/>
+              </m:rPr>
+              <m:t>=</m:t>
+            </m:r>
+            <m:box>
+              <m:e>
+                <m:d>
+                  <m:dPr>
+                    <m:begChr m:val="{"/>
+                    <m:endChr m:val=""/>
+                  </m:dPr>
+                  <m:e>
+                    <m:box>
+                      <m:e>
+                        <m:m>
+                          <m:mr>
+                            <m:e>
+                              <m:box>
+                                <m:e>
+                                  <m:r>
+                                    <m:rPr>
+                                      <m:sty m:val="i"/>
+                                    </m:rPr>
+                                    <m:t>p</m:t>
+                                  </m:r>
+                                </m:e>
+                              </m:box>
+                            </m:e>
+                            <m:e>
+                              <m:box>
+                                <m:e>
+                                  <m:r>
+                                    <m:rPr>
+                                      <m:nor/>
+                                    </m:rPr>
+                                    <m:t>if </m:t>
+                                  </m:r>
+                                  <m:sSub>
+                                    <m:e>
+                                      <m:r>
+                                        <m:rPr>
+                                          <m:sty m:val="i"/>
+                                        </m:rPr>
+                                        <m:t>y</m:t>
+                                      </m:r>
+                                    </m:e>
+                                    <m:sub>
+                                      <m:r>
+                                        <m:rPr>
+                                          <m:sty m:val="i"/>
+                                        </m:rPr>
+                                        <m:t>i</m:t>
+                                      </m:r>
+                                    </m:sub>
+                                  </m:sSub>
+                                  <m:r>
+                                    <m:rPr>
+                                      <m:sty m:val="p"/>
+                                    </m:rPr>
+                                    <m:t>&gt;</m:t>
+                                  </m:r>
+                                  <m:sSub>
+                                    <m:e>
+                                      <m:r>
+                                        <m:rPr>
+                                          <m:sty m:val="i"/>
+                                        </m:rPr>
+                                        <m:t>z</m:t>
+                                      </m:r>
+                                    </m:e>
+                                    <m:sub>
+                                      <m:r>
+                                        <m:rPr>
+                                          <m:sty m:val="i"/>
+                                        </m:rPr>
+                                        <m:t>i</m:t>
+                                      </m:r>
+                                    </m:sub>
+                                  </m:sSub>
+                                </m:e>
+                              </m:box>
+                            </m:e>
+                          </m:mr>
+                          <m:mr>
+                            <m:e>
+                              <m:box>
+                                <m:e>
+                                  <m:r>
+                                    <m:rPr>
+                                      <m:sty m:val="p"/>
+                                    </m:rPr>
+                                    <m:t>1</m:t>
+                                  </m:r>
+                                  <m:r>
+                                    <m:rPr>
+                                      <m:sty m:val="p"/>
+                                    </m:rPr>
+                                    <m:t>−</m:t>
+                                  </m:r>
+                                  <m:r>
+                                    <m:rPr>
+                                      <m:sty m:val="i"/>
+                                    </m:rPr>
+                                    <m:t>p</m:t>
+                                  </m:r>
+                                </m:e>
+                              </m:box>
+                            </m:e>
+                            <m:e>
+                              <m:box>
+                                <m:e>
+                                  <m:r>
+                                    <m:rPr>
+                                      <m:nor/>
+                                    </m:rPr>
+                                    <m:t>if </m:t>
+                                  </m:r>
+                                  <m:sSub>
+                                    <m:e>
+                                      <m:r>
+                                        <m:rPr>
+                                          <m:sty m:val="i"/>
+                                        </m:rPr>
+                                        <m:t>y</m:t>
+                                      </m:r>
+                                    </m:e>
+                                    <m:sub>
+                                      <m:r>
+                                        <m:rPr>
+                                          <m:sty m:val="i"/>
+                                        </m:rPr>
+                                        <m:t>i</m:t>
+                                      </m:r>
+                                    </m:sub>
+                                  </m:sSub>
+                                  <m:r>
+                                    <m:rPr>
+                                      <m:sty m:val="p"/>
+                                    </m:rPr>
+                                    <m:t>≤</m:t>
+                                  </m:r>
+                                  <m:sSub>
+                                    <m:e>
+                                      <m:r>
+                                        <m:rPr>
+                                          <m:sty m:val="i"/>
+                                        </m:rPr>
+                                        <m:t>z</m:t>
+                                      </m:r>
+                                    </m:e>
+                                    <m:sub>
+                                      <m:r>
+                                        <m:rPr>
+                                          <m:sty m:val="i"/>
+                                        </m:rPr>
+                                        <m:t>i</m:t>
+                                      </m:r>
+                                    </m:sub>
+                                  </m:sSub>
+                                </m:e>
+                              </m:box>
+                            </m:e>
+                          </m:mr>
+                        </m:m>
+                      </m:e>
+                    </m:box>
+                  </m:e>
+                </m:d>
+              </m:e>
+            </m:box>
+          </m:e>
+        </m:box>
+      </m:oMath>
       <w:r/>
     </w:p>
     <w:p>
@@ -508,21 +1081,48 @@
       <w:r>
         <w:t xml:space="preserve">We keep the asymmetry parameter </w:t>
       </w:r>
-      <w:r>
-        <w:t>p</w:t>
-      </w:r>
+      <m:oMath>
+        <m:box>
+          <m:e>
+            <m:r>
+              <m:rPr>
+                <m:sty m:val="i"/>
+              </m:rPr>
+              <m:t>p</m:t>
+            </m:r>
+          </m:e>
+        </m:box>
+      </m:oMath>
       <w:r>
         <w:t xml:space="preserve"> between </w:t>
       </w:r>
-      <w:r>
-        <w:t>0.001</w:t>
-      </w:r>
+      <m:oMath>
+        <m:box>
+          <m:e>
+            <m:r>
+              <m:rPr>
+                <m:sty m:val="p"/>
+              </m:rPr>
+              <m:t>0.001</m:t>
+            </m:r>
+          </m:e>
+        </m:box>
+      </m:oMath>
       <w:r>
         <w:t xml:space="preserve"> and </w:t>
       </w:r>
-      <w:r>
-        <w:t>0.01</w:t>
-      </w:r>
+      <m:oMath>
+        <m:box>
+          <m:e>
+            <m:r>
+              <m:rPr>
+                <m:sty m:val="p"/>
+              </m:rPr>
+              <m:t>0.01</m:t>
+            </m:r>
+          </m:e>
+        </m:box>
+      </m:oMath>
       <w:r>
         <w:t xml:space="preserve"> so the baseline doesn't eat into the real peaks.</w:t>
       </w:r>
@@ -569,15 +1169,91 @@
       <w:r>
         <w:t>*USP Tailing Factor (</w:t>
       </w:r>
-      <w:r>
-        <w:t>T</w:t>
-      </w:r>
+      <m:oMath>
+        <m:box>
+          <m:e>
+            <m:r>
+              <m:rPr>
+                <m:sty m:val="i"/>
+              </m:rPr>
+              <m:t>T</m:t>
+            </m:r>
+          </m:e>
+        </m:box>
+      </m:oMath>
       <w:r>
         <w:t xml:space="preserve">):* Evaluated at 5% peak height: </w:t>
       </w:r>
-      <w:r>
-        <w:t>T = W_0.05 / (2f)</w:t>
-      </w:r>
+      <m:oMath>
+        <m:box>
+          <m:e>
+            <m:r>
+              <m:rPr>
+                <m:sty m:val="i"/>
+              </m:rPr>
+              <m:t>T</m:t>
+            </m:r>
+            <m:r>
+              <m:rPr>
+                <m:sty m:val="p"/>
+              </m:rPr>
+              <m:t>=</m:t>
+            </m:r>
+            <m:sSub>
+              <m:e>
+                <m:r>
+                  <m:rPr>
+                    <m:sty m:val="i"/>
+                  </m:rPr>
+                  <m:t>W</m:t>
+                </m:r>
+              </m:e>
+              <m:sub>
+                <m:box>
+                  <m:e>
+                    <m:r>
+                      <m:rPr>
+                        <m:sty m:val="p"/>
+                      </m:rPr>
+                      <m:t>0.05</m:t>
+                    </m:r>
+                  </m:e>
+                </m:box>
+              </m:sub>
+            </m:sSub>
+            <m:r>
+              <m:rPr>
+                <m:sty m:val="p"/>
+              </m:rPr>
+              <m:t>/</m:t>
+            </m:r>
+            <m:r>
+              <m:rPr>
+                <m:sty m:val="p"/>
+              </m:rPr>
+              <m:t>(</m:t>
+            </m:r>
+            <m:r>
+              <m:rPr>
+                <m:sty m:val="p"/>
+              </m:rPr>
+              <m:t>2</m:t>
+            </m:r>
+            <m:r>
+              <m:rPr>
+                <m:sty m:val="i"/>
+              </m:rPr>
+              <m:t>f</m:t>
+            </m:r>
+            <m:r>
+              <m:rPr>
+                <m:sty m:val="p"/>
+              </m:rPr>
+              <m:t>)</m:t>
+            </m:r>
+          </m:e>
+        </m:box>
+      </m:oMath>
       <w:r>
         <w:t xml:space="preserve"> with sub-point interpolation.</w:t>
       </w:r>
@@ -590,15 +1266,115 @@
       <w:r>
         <w:t>*Theoretical Plate Count (</w:t>
       </w:r>
-      <w:r>
-        <w:t>N</w:t>
-      </w:r>
+      <m:oMath>
+        <m:box>
+          <m:e>
+            <m:r>
+              <m:rPr>
+                <m:sty m:val="i"/>
+              </m:rPr>
+              <m:t>N</m:t>
+            </m:r>
+          </m:e>
+        </m:box>
+      </m:oMath>
       <w:r>
         <w:t xml:space="preserve">):* Evaluated at 50% peak height: </w:t>
       </w:r>
-      <w:r>
-        <w:t>N = 5.54 (t_R / W_0.5)^2</w:t>
-      </w:r>
+      <m:oMath>
+        <m:box>
+          <m:e>
+            <m:r>
+              <m:rPr>
+                <m:sty m:val="i"/>
+              </m:rPr>
+              <m:t>N</m:t>
+            </m:r>
+            <m:r>
+              <m:rPr>
+                <m:sty m:val="p"/>
+              </m:rPr>
+              <m:t>=</m:t>
+            </m:r>
+            <m:r>
+              <m:rPr>
+                <m:sty m:val="p"/>
+              </m:rPr>
+              <m:t>5.54</m:t>
+            </m:r>
+            <m:r>
+              <m:rPr>
+                <m:sty m:val="p"/>
+              </m:rPr>
+              <m:t>(</m:t>
+            </m:r>
+            <m:sSub>
+              <m:e>
+                <m:r>
+                  <m:rPr>
+                    <m:sty m:val="i"/>
+                  </m:rPr>
+                  <m:t>t</m:t>
+                </m:r>
+              </m:e>
+              <m:sub>
+                <m:r>
+                  <m:rPr>
+                    <m:sty m:val="i"/>
+                  </m:rPr>
+                  <m:t>R</m:t>
+                </m:r>
+              </m:sub>
+            </m:sSub>
+            <m:r>
+              <m:rPr>
+                <m:sty m:val="p"/>
+              </m:rPr>
+              <m:t>/</m:t>
+            </m:r>
+            <m:sSub>
+              <m:e>
+                <m:r>
+                  <m:rPr>
+                    <m:sty m:val="i"/>
+                  </m:rPr>
+                  <m:t>W</m:t>
+                </m:r>
+              </m:e>
+              <m:sub>
+                <m:box>
+                  <m:e>
+                    <m:r>
+                      <m:rPr>
+                        <m:sty m:val="p"/>
+                      </m:rPr>
+                      <m:t>0.5</m:t>
+                    </m:r>
+                  </m:e>
+                </m:box>
+              </m:sub>
+            </m:sSub>
+            <m:sSup>
+              <m:e>
+                <m:r>
+                  <m:rPr>
+                    <m:sty m:val="p"/>
+                  </m:rPr>
+                  <m:t>)</m:t>
+                </m:r>
+              </m:e>
+              <m:sup>
+                <m:r>
+                  <m:rPr>
+                    <m:sty m:val="p"/>
+                  </m:rPr>
+                  <m:t>2</m:t>
+                </m:r>
+              </m:sup>
+            </m:sSup>
+          </m:e>
+        </m:box>
+      </m:oMath>
       <w:r>
         <w:t>.</w:t>
       </w:r>
@@ -611,15 +1387,203 @@
       <w:r>
         <w:t>*USP Peak Resolution (</w:t>
       </w:r>
-      <w:r>
-        <w:t>R_s</w:t>
-      </w:r>
+      <m:oMath>
+        <m:box>
+          <m:e>
+            <m:sSub>
+              <m:e>
+                <m:r>
+                  <m:rPr>
+                    <m:sty m:val="i"/>
+                  </m:rPr>
+                  <m:t>R</m:t>
+                </m:r>
+              </m:e>
+              <m:sub>
+                <m:r>
+                  <m:rPr>
+                    <m:sty m:val="i"/>
+                  </m:rPr>
+                  <m:t>s</m:t>
+                </m:r>
+              </m:sub>
+            </m:sSub>
+          </m:e>
+        </m:box>
+      </m:oMath>
       <w:r>
         <w:t xml:space="preserve">):* Evaluated between adjacent peaks: </w:t>
       </w:r>
-      <w:r>
-        <w:t>R_s = 2(t_R2 - t_R1) / (w_1 + w_2)</w:t>
-      </w:r>
+      <m:oMath>
+        <m:box>
+          <m:e>
+            <m:sSub>
+              <m:e>
+                <m:r>
+                  <m:rPr>
+                    <m:sty m:val="i"/>
+                  </m:rPr>
+                  <m:t>R</m:t>
+                </m:r>
+              </m:e>
+              <m:sub>
+                <m:r>
+                  <m:rPr>
+                    <m:sty m:val="i"/>
+                  </m:rPr>
+                  <m:t>s</m:t>
+                </m:r>
+              </m:sub>
+            </m:sSub>
+            <m:r>
+              <m:rPr>
+                <m:sty m:val="p"/>
+              </m:rPr>
+              <m:t>=</m:t>
+            </m:r>
+            <m:r>
+              <m:rPr>
+                <m:sty m:val="p"/>
+              </m:rPr>
+              <m:t>2</m:t>
+            </m:r>
+            <m:r>
+              <m:rPr>
+                <m:sty m:val="p"/>
+              </m:rPr>
+              <m:t>(</m:t>
+            </m:r>
+            <m:sSub>
+              <m:e>
+                <m:r>
+                  <m:rPr>
+                    <m:sty m:val="i"/>
+                  </m:rPr>
+                  <m:t>t</m:t>
+                </m:r>
+              </m:e>
+              <m:sub>
+                <m:box>
+                  <m:e>
+                    <m:r>
+                      <m:rPr>
+                        <m:sty m:val="i"/>
+                      </m:rPr>
+                      <m:t>R</m:t>
+                    </m:r>
+                    <m:r>
+                      <m:rPr>
+                        <m:sty m:val="p"/>
+                      </m:rPr>
+                      <m:t>2</m:t>
+                    </m:r>
+                  </m:e>
+                </m:box>
+              </m:sub>
+            </m:sSub>
+            <m:r>
+              <m:rPr>
+                <m:sty m:val="p"/>
+              </m:rPr>
+              <m:t>−</m:t>
+            </m:r>
+            <m:sSub>
+              <m:e>
+                <m:r>
+                  <m:rPr>
+                    <m:sty m:val="i"/>
+                  </m:rPr>
+                  <m:t>t</m:t>
+                </m:r>
+              </m:e>
+              <m:sub>
+                <m:box>
+                  <m:e>
+                    <m:r>
+                      <m:rPr>
+                        <m:sty m:val="i"/>
+                      </m:rPr>
+                      <m:t>R</m:t>
+                    </m:r>
+                    <m:r>
+                      <m:rPr>
+                        <m:sty m:val="p"/>
+                      </m:rPr>
+                      <m:t>1</m:t>
+                    </m:r>
+                  </m:e>
+                </m:box>
+              </m:sub>
+            </m:sSub>
+            <m:r>
+              <m:rPr>
+                <m:sty m:val="p"/>
+              </m:rPr>
+              <m:t>)</m:t>
+            </m:r>
+            <m:r>
+              <m:rPr>
+                <m:sty m:val="p"/>
+              </m:rPr>
+              <m:t>/</m:t>
+            </m:r>
+            <m:r>
+              <m:rPr>
+                <m:sty m:val="p"/>
+              </m:rPr>
+              <m:t>(</m:t>
+            </m:r>
+            <m:sSub>
+              <m:e>
+                <m:r>
+                  <m:rPr>
+                    <m:sty m:val="i"/>
+                  </m:rPr>
+                  <m:t>w</m:t>
+                </m:r>
+              </m:e>
+              <m:sub>
+                <m:r>
+                  <m:rPr>
+                    <m:sty m:val="p"/>
+                  </m:rPr>
+                  <m:t>1</m:t>
+                </m:r>
+              </m:sub>
+            </m:sSub>
+            <m:r>
+              <m:rPr>
+                <m:sty m:val="p"/>
+              </m:rPr>
+              <m:t>+</m:t>
+            </m:r>
+            <m:sSub>
+              <m:e>
+                <m:r>
+                  <m:rPr>
+                    <m:sty m:val="i"/>
+                  </m:rPr>
+                  <m:t>w</m:t>
+                </m:r>
+              </m:e>
+              <m:sub>
+                <m:r>
+                  <m:rPr>
+                    <m:sty m:val="p"/>
+                  </m:rPr>
+                  <m:t>2</m:t>
+                </m:r>
+              </m:sub>
+            </m:sSub>
+            <m:r>
+              <m:rPr>
+                <m:sty m:val="p"/>
+              </m:rPr>
+              <m:t>)</m:t>
+            </m:r>
+          </m:e>
+        </m:box>
+      </m:oMath>
       <w:r>
         <w:t>.</w:t>
       </w:r>
@@ -632,9 +1596,30 @@
       <w:r>
         <w:t>*Signal-to-Noise Ratio (</w:t>
       </w:r>
-      <w:r>
-        <w:t>S/N</w:t>
-      </w:r>
+      <m:oMath>
+        <m:box>
+          <m:e>
+            <m:r>
+              <m:rPr>
+                <m:sty m:val="i"/>
+              </m:rPr>
+              <m:t>S</m:t>
+            </m:r>
+            <m:r>
+              <m:rPr>
+                <m:sty m:val="p"/>
+              </m:rPr>
+              <m:t>/</m:t>
+            </m:r>
+            <m:r>
+              <m:rPr>
+                <m:sty m:val="i"/>
+              </m:rPr>
+              <m:t>N</m:t>
+            </m:r>
+          </m:e>
+        </m:box>
+      </m:oMath>
       <w:r>
         <w:t>):* Calculates baseline noise standard deviation from signal points outside of all peak regions.</w:t>
       </w:r>
@@ -649,12 +1634,220 @@
     </w:p>
     <w:p>
       <w:pPr>
-        <w:spacing w:after="120" w:line="276" w:lineRule="auto"/>
+        <w:spacing w:after="240" w:line="276" w:lineRule="auto" w:before="120"/>
+        <w:jc w:val="center"/>
       </w:pPr>
       <w:r/>
-      <w:r>
-        <w:t>A = Σ [ (y_(i-1) + y_i) / 2 ] * (x_i - x_(i-1))</w:t>
-      </w:r>
+      <m:oMath>
+        <m:box>
+          <m:e>
+            <m:r>
+              <m:rPr>
+                <m:sty m:val="i"/>
+              </m:rPr>
+              <m:t>A</m:t>
+            </m:r>
+            <m:r>
+              <m:rPr>
+                <m:sty m:val="p"/>
+              </m:rPr>
+              <m:t>=</m:t>
+            </m:r>
+            <m:nary>
+              <m:naryPr>
+                <m:chr m:val="∑"/>
+                <m:limLoc m:val="undOvr"/>
+              </m:naryPr>
+              <m:sub>
+                <m:box>
+                  <m:e>
+                    <m:r>
+                      <m:rPr>
+                        <m:sty m:val="i"/>
+                      </m:rPr>
+                      <m:t>i</m:t>
+                    </m:r>
+                    <m:r>
+                      <m:rPr>
+                        <m:sty m:val="p"/>
+                      </m:rPr>
+                      <m:t>=</m:t>
+                    </m:r>
+                    <m:r>
+                      <m:rPr>
+                        <m:sty m:val="p"/>
+                      </m:rPr>
+                      <m:t>1</m:t>
+                    </m:r>
+                  </m:e>
+                </m:box>
+              </m:sub>
+              <m:sup>
+                <m:box>
+                  <m:e>
+                    <m:r>
+                      <m:rPr>
+                        <m:sty m:val="i"/>
+                      </m:rPr>
+                      <m:t>n</m:t>
+                    </m:r>
+                  </m:e>
+                </m:box>
+              </m:sup>
+              <m:e>
+                <m:f>
+                  <m:num>
+                    <m:box>
+                      <m:e>
+                        <m:sSub>
+                          <m:e>
+                            <m:r>
+                              <m:rPr>
+                                <m:sty m:val="i"/>
+                              </m:rPr>
+                              <m:t>y</m:t>
+                            </m:r>
+                          </m:e>
+                          <m:sub>
+                            <m:box>
+                              <m:e>
+                                <m:r>
+                                  <m:rPr>
+                                    <m:sty m:val="i"/>
+                                  </m:rPr>
+                                  <m:t>i</m:t>
+                                </m:r>
+                                <m:r>
+                                  <m:rPr>
+                                    <m:sty m:val="p"/>
+                                  </m:rPr>
+                                  <m:t>−</m:t>
+                                </m:r>
+                                <m:r>
+                                  <m:rPr>
+                                    <m:sty m:val="p"/>
+                                  </m:rPr>
+                                  <m:t>1</m:t>
+                                </m:r>
+                              </m:e>
+                            </m:box>
+                          </m:sub>
+                        </m:sSub>
+                        <m:r>
+                          <m:rPr>
+                            <m:sty m:val="p"/>
+                          </m:rPr>
+                          <m:t>+</m:t>
+                        </m:r>
+                        <m:sSub>
+                          <m:e>
+                            <m:r>
+                              <m:rPr>
+                                <m:sty m:val="i"/>
+                              </m:rPr>
+                              <m:t>y</m:t>
+                            </m:r>
+                          </m:e>
+                          <m:sub>
+                            <m:r>
+                              <m:rPr>
+                                <m:sty m:val="i"/>
+                              </m:rPr>
+                              <m:t>i</m:t>
+                            </m:r>
+                          </m:sub>
+                        </m:sSub>
+                      </m:e>
+                    </m:box>
+                  </m:num>
+                  <m:den>
+                    <m:box>
+                      <m:e>
+                        <m:r>
+                          <m:rPr>
+                            <m:sty m:val="p"/>
+                          </m:rPr>
+                          <m:t>2</m:t>
+                        </m:r>
+                      </m:e>
+                    </m:box>
+                  </m:den>
+                </m:f>
+                <m:r>
+                  <m:rPr>
+                    <m:sty m:val="p"/>
+                  </m:rPr>
+                  <m:t>(</m:t>
+                </m:r>
+                <m:sSub>
+                  <m:e>
+                    <m:r>
+                      <m:rPr>
+                        <m:sty m:val="i"/>
+                      </m:rPr>
+                      <m:t>x</m:t>
+                    </m:r>
+                  </m:e>
+                  <m:sub>
+                    <m:r>
+                      <m:rPr>
+                        <m:sty m:val="i"/>
+                      </m:rPr>
+                      <m:t>i</m:t>
+                    </m:r>
+                  </m:sub>
+                </m:sSub>
+                <m:r>
+                  <m:rPr>
+                    <m:sty m:val="p"/>
+                  </m:rPr>
+                  <m:t>−</m:t>
+                </m:r>
+                <m:sSub>
+                  <m:e>
+                    <m:r>
+                      <m:rPr>
+                        <m:sty m:val="i"/>
+                      </m:rPr>
+                      <m:t>x</m:t>
+                    </m:r>
+                  </m:e>
+                  <m:sub>
+                    <m:box>
+                      <m:e>
+                        <m:r>
+                          <m:rPr>
+                            <m:sty m:val="i"/>
+                          </m:rPr>
+                          <m:t>i</m:t>
+                        </m:r>
+                        <m:r>
+                          <m:rPr>
+                            <m:sty m:val="p"/>
+                          </m:rPr>
+                          <m:t>−</m:t>
+                        </m:r>
+                        <m:r>
+                          <m:rPr>
+                            <m:sty m:val="p"/>
+                          </m:rPr>
+                          <m:t>1</m:t>
+                        </m:r>
+                      </m:e>
+                    </m:box>
+                  </m:sub>
+                </m:sSub>
+                <m:r>
+                  <m:rPr>
+                    <m:sty m:val="p"/>
+                  </m:rPr>
+                  <m:t>)</m:t>
+                </m:r>
+              </m:e>
+            </m:nary>
+          </m:e>
+        </m:box>
+      </m:oMath>
       <w:r/>
     </w:p>
     <w:p>
@@ -680,21 +1873,142 @@
       <w:r>
         <w:t xml:space="preserve"> Standard integration methods fail when peaks overlap, double-counting the shared signal area. We solve this by building a 1D temporal-spectral graph </w:t>
       </w:r>
-      <w:r>
-        <w:t>G = (V, E)</w:t>
-      </w:r>
+      <m:oMath>
+        <m:box>
+          <m:e>
+            <m:r>
+              <m:rPr>
+                <m:sty m:val="i"/>
+              </m:rPr>
+              <m:t>G</m:t>
+            </m:r>
+            <m:r>
+              <m:rPr>
+                <m:sty m:val="p"/>
+              </m:rPr>
+              <m:t>=</m:t>
+            </m:r>
+            <m:r>
+              <m:rPr>
+                <m:sty m:val="p"/>
+              </m:rPr>
+              <m:t>(</m:t>
+            </m:r>
+            <m:r>
+              <m:rPr>
+                <m:sty m:val="i"/>
+              </m:rPr>
+              <m:t>V</m:t>
+            </m:r>
+            <m:r>
+              <m:rPr>
+                <m:sty m:val="p"/>
+              </m:rPr>
+              <m:t>,</m:t>
+            </m:r>
+            <m:r>
+              <m:rPr>
+                <m:sty m:val="i"/>
+              </m:rPr>
+              <m:t>E</m:t>
+            </m:r>
+            <m:r>
+              <m:rPr>
+                <m:sty m:val="p"/>
+              </m:rPr>
+              <m:t>)</m:t>
+            </m:r>
+          </m:e>
+        </m:box>
+      </m:oMath>
       <w:r>
         <w:t xml:space="preserve"> for each co-eluting region where scan steps are nodes </w:t>
       </w:r>
-      <w:r>
-        <w:t>v_i ∈ V</w:t>
-      </w:r>
+      <m:oMath>
+        <m:box>
+          <m:e>
+            <m:sSub>
+              <m:e>
+                <m:r>
+                  <m:rPr>
+                    <m:sty m:val="i"/>
+                  </m:rPr>
+                  <m:t>v</m:t>
+                </m:r>
+              </m:e>
+              <m:sub>
+                <m:r>
+                  <m:rPr>
+                    <m:sty m:val="i"/>
+                  </m:rPr>
+                  <m:t>i</m:t>
+                </m:r>
+              </m:sub>
+            </m:sSub>
+            <m:r>
+              <m:rPr>
+                <m:sty m:val="p"/>
+              </m:rPr>
+              <m:t>∈</m:t>
+            </m:r>
+            <m:r>
+              <m:rPr>
+                <m:sty m:val="i"/>
+              </m:rPr>
+              <m:t>V</m:t>
+            </m:r>
+          </m:e>
+        </m:box>
+      </m:oMath>
       <w:r>
         <w:t xml:space="preserve"> and edges </w:t>
       </w:r>
-      <w:r>
-        <w:t>e_ij ∈ E</w:t>
-      </w:r>
+      <m:oMath>
+        <m:box>
+          <m:e>
+            <m:sSub>
+              <m:e>
+                <m:r>
+                  <m:rPr>
+                    <m:sty m:val="i"/>
+                  </m:rPr>
+                  <m:t>e</m:t>
+                </m:r>
+              </m:e>
+              <m:sub>
+                <m:box>
+                  <m:e>
+                    <m:r>
+                      <m:rPr>
+                        <m:sty m:val="i"/>
+                      </m:rPr>
+                      <m:t>i</m:t>
+                    </m:r>
+                    <m:r>
+                      <m:rPr>
+                        <m:sty m:val="i"/>
+                      </m:rPr>
+                      <m:t>j</m:t>
+                    </m:r>
+                  </m:e>
+                </m:box>
+              </m:sub>
+            </m:sSub>
+            <m:r>
+              <m:rPr>
+                <m:sty m:val="p"/>
+              </m:rPr>
+              <m:t>∈</m:t>
+            </m:r>
+            <m:r>
+              <m:rPr>
+                <m:sty m:val="i"/>
+              </m:rPr>
+              <m:t>E</m:t>
+            </m:r>
+          </m:e>
+        </m:box>
+      </m:oMath>
       <w:r>
         <w:t xml:space="preserve"> connect adjacent time points.</w:t>
       </w:r>
@@ -715,21 +2029,293 @@
       <w:r>
         <w:t xml:space="preserve"> to dynamically optimize the GCN graph connectivity parameter (temporal proximity threshold </w:t>
       </w:r>
-      <w:r>
-        <w:t>θ_p</w:t>
-      </w:r>
+      <m:oMath>
+        <m:box>
+          <m:e>
+            <m:sSub>
+              <m:e>
+                <m:r>
+                  <m:rPr>
+                    <m:sty m:val="i"/>
+                  </m:rPr>
+                  <m:t>θ</m:t>
+                </m:r>
+              </m:e>
+              <m:sub>
+                <m:r>
+                  <m:rPr>
+                    <m:sty m:val="i"/>
+                  </m:rPr>
+                  <m:t>p</m:t>
+                </m:r>
+              </m:sub>
+            </m:sSub>
+          </m:e>
+        </m:box>
+      </m:oMath>
       <w:r>
         <w:t>) based on local peak density, widths, and spectral similarity:</w:t>
       </w:r>
     </w:p>
     <w:p>
       <w:pPr>
-        <w:spacing w:after="120" w:line="276" w:lineRule="auto"/>
+        <w:spacing w:after="240" w:line="276" w:lineRule="auto" w:before="120"/>
+        <w:jc w:val="center"/>
       </w:pPr>
       <w:r/>
-      <w:r>
-        <w:t>θ_p = clip( W_norm × 1.5 × (1 / √K) × (1 - 0.25 * C_avg), 0.1, 0.7 )</w:t>
-      </w:r>
+      <m:oMath>
+        <m:box>
+          <m:e>
+            <m:sSub>
+              <m:e>
+                <m:r>
+                  <m:rPr>
+                    <m:sty m:val="i"/>
+                  </m:rPr>
+                  <m:t>θ</m:t>
+                </m:r>
+              </m:e>
+              <m:sub>
+                <m:r>
+                  <m:rPr>
+                    <m:sty m:val="i"/>
+                  </m:rPr>
+                  <m:t>p</m:t>
+                </m:r>
+              </m:sub>
+            </m:sSub>
+            <m:r>
+              <m:rPr>
+                <m:sty m:val="p"/>
+              </m:rPr>
+              <m:t>=</m:t>
+            </m:r>
+            <m:r>
+              <m:rPr>
+                <m:nor/>
+              </m:rPr>
+              <m:t>clip</m:t>
+            </m:r>
+            <m:box>
+              <m:e>
+                <m:d>
+                  <m:dPr>
+                    <m:begChr m:val="("/>
+                    <m:endChr m:val=")"/>
+                  </m:dPr>
+                  <m:e>
+                    <m:box>
+                      <m:e>
+                        <m:sSub>
+                          <m:e>
+                            <m:acc>
+                              <m:accPr>
+                                <m:chr m:val="¯"/>
+                              </m:accPr>
+                              <m:e>
+                                <m:box>
+                                  <m:e>
+                                    <m:r>
+                                      <m:rPr>
+                                        <m:sty m:val="i"/>
+                                      </m:rPr>
+                                      <m:t>W</m:t>
+                                    </m:r>
+                                  </m:e>
+                                </m:box>
+                              </m:e>
+                            </m:acc>
+                          </m:e>
+                          <m:sub>
+                            <m:box>
+                              <m:e>
+                                <m:r>
+                                  <m:rPr>
+                                    <m:sty m:val="i"/>
+                                  </m:rPr>
+                                  <m:t>n</m:t>
+                                </m:r>
+                                <m:r>
+                                  <m:rPr>
+                                    <m:sty m:val="i"/>
+                                  </m:rPr>
+                                  <m:t>o</m:t>
+                                </m:r>
+                                <m:r>
+                                  <m:rPr>
+                                    <m:sty m:val="i"/>
+                                  </m:rPr>
+                                  <m:t>r</m:t>
+                                </m:r>
+                                <m:r>
+                                  <m:rPr>
+                                    <m:sty m:val="i"/>
+                                  </m:rPr>
+                                  <m:t>m</m:t>
+                                </m:r>
+                              </m:e>
+                            </m:box>
+                          </m:sub>
+                        </m:sSub>
+                        <m:r>
+                          <m:rPr>
+                            <m:sty m:val="p"/>
+                          </m:rPr>
+                          <m:t>×</m:t>
+                        </m:r>
+                        <m:r>
+                          <m:rPr>
+                            <m:sty m:val="p"/>
+                          </m:rPr>
+                          <m:t>1.5</m:t>
+                        </m:r>
+                        <m:r>
+                          <m:rPr>
+                            <m:sty m:val="p"/>
+                          </m:rPr>
+                          <m:t>×</m:t>
+                        </m:r>
+                        <m:f>
+                          <m:num>
+                            <m:box>
+                              <m:e>
+                                <m:r>
+                                  <m:rPr>
+                                    <m:sty m:val="p"/>
+                                  </m:rPr>
+                                  <m:t>1</m:t>
+                                </m:r>
+                              </m:e>
+                            </m:box>
+                          </m:num>
+                          <m:den>
+                            <m:box>
+                              <m:e>
+                                <m:rad>
+                                  <m:e>
+                                    <m:box>
+                                      <m:e>
+                                        <m:box>
+                                          <m:e>
+                                            <m:r>
+                                              <m:rPr>
+                                                <m:sty m:val="i"/>
+                                              </m:rPr>
+                                              <m:t>K</m:t>
+                                            </m:r>
+                                          </m:e>
+                                        </m:box>
+                                      </m:e>
+                                    </m:box>
+                                  </m:e>
+                                </m:rad>
+                              </m:e>
+                            </m:box>
+                          </m:den>
+                        </m:f>
+                        <m:r>
+                          <m:rPr>
+                            <m:sty m:val="p"/>
+                          </m:rPr>
+                          <m:t>×</m:t>
+                        </m:r>
+                        <m:r>
+                          <m:rPr>
+                            <m:sty m:val="p"/>
+                          </m:rPr>
+                          <m:t>(</m:t>
+                        </m:r>
+                        <m:r>
+                          <m:rPr>
+                            <m:sty m:val="p"/>
+                          </m:rPr>
+                          <m:t>1</m:t>
+                        </m:r>
+                        <m:r>
+                          <m:rPr>
+                            <m:sty m:val="p"/>
+                          </m:rPr>
+                          <m:t>−</m:t>
+                        </m:r>
+                        <m:r>
+                          <m:rPr>
+                            <m:sty m:val="p"/>
+                          </m:rPr>
+                          <m:t>0.25</m:t>
+                        </m:r>
+                        <m:sSub>
+                          <m:e>
+                            <m:r>
+                              <m:rPr>
+                                <m:sty m:val="i"/>
+                              </m:rPr>
+                              <m:t>C</m:t>
+                            </m:r>
+                          </m:e>
+                          <m:sub>
+                            <m:box>
+                              <m:e>
+                                <m:r>
+                                  <m:rPr>
+                                    <m:sty m:val="i"/>
+                                  </m:rPr>
+                                  <m:t>a</m:t>
+                                </m:r>
+                                <m:r>
+                                  <m:rPr>
+                                    <m:sty m:val="i"/>
+                                  </m:rPr>
+                                  <m:t>v</m:t>
+                                </m:r>
+                                <m:r>
+                                  <m:rPr>
+                                    <m:sty m:val="i"/>
+                                  </m:rPr>
+                                  <m:t>g</m:t>
+                                </m:r>
+                              </m:e>
+                            </m:box>
+                          </m:sub>
+                        </m:sSub>
+                        <m:r>
+                          <m:rPr>
+                            <m:sty m:val="p"/>
+                          </m:rPr>
+                          <m:t>)</m:t>
+                        </m:r>
+                        <m:r>
+                          <m:rPr>
+                            <m:sty m:val="p"/>
+                          </m:rPr>
+                          <m:t>,</m:t>
+                        </m:r>
+                        <m:r>
+                          <m:rPr>
+                            <m:sty m:val="p"/>
+                          </m:rPr>
+                          <m:t>0.1</m:t>
+                        </m:r>
+                        <m:r>
+                          <m:rPr>
+                            <m:sty m:val="p"/>
+                          </m:rPr>
+                          <m:t>,</m:t>
+                        </m:r>
+                        <m:r>
+                          <m:rPr>
+                            <m:sty m:val="p"/>
+                          </m:rPr>
+                          <m:t>0.7</m:t>
+                        </m:r>
+                      </m:e>
+                    </m:box>
+                  </m:e>
+                </m:d>
+              </m:e>
+            </m:box>
+          </m:e>
+        </m:box>
+      </m:oMath>
       <w:r/>
     </w:p>
     <w:p>
@@ -739,21 +2325,121 @@
       <w:r>
         <w:t xml:space="preserve">where </w:t>
       </w:r>
-      <w:r>
-        <w:t>W_bar_norm</w:t>
-      </w:r>
+      <m:oMath>
+        <m:box>
+          <m:e>
+            <m:sSub>
+              <m:e>
+                <m:acc>
+                  <m:accPr>
+                    <m:chr m:val="¯"/>
+                  </m:accPr>
+                  <m:e>
+                    <m:box>
+                      <m:e>
+                        <m:r>
+                          <m:rPr>
+                            <m:sty m:val="i"/>
+                          </m:rPr>
+                          <m:t>W</m:t>
+                        </m:r>
+                      </m:e>
+                    </m:box>
+                  </m:e>
+                </m:acc>
+              </m:e>
+              <m:sub>
+                <m:box>
+                  <m:e>
+                    <m:r>
+                      <m:rPr>
+                        <m:sty m:val="i"/>
+                      </m:rPr>
+                      <m:t>n</m:t>
+                    </m:r>
+                    <m:r>
+                      <m:rPr>
+                        <m:sty m:val="i"/>
+                      </m:rPr>
+                      <m:t>o</m:t>
+                    </m:r>
+                    <m:r>
+                      <m:rPr>
+                        <m:sty m:val="i"/>
+                      </m:rPr>
+                      <m:t>r</m:t>
+                    </m:r>
+                    <m:r>
+                      <m:rPr>
+                        <m:sty m:val="i"/>
+                      </m:rPr>
+                      <m:t>m</m:t>
+                    </m:r>
+                  </m:e>
+                </m:box>
+              </m:sub>
+            </m:sSub>
+          </m:e>
+        </m:box>
+      </m:oMath>
       <w:r>
         <w:t xml:space="preserve"> is the average normalized peak width, </w:t>
       </w:r>
-      <w:r>
-        <w:t>K</w:t>
-      </w:r>
+      <m:oMath>
+        <m:box>
+          <m:e>
+            <m:r>
+              <m:rPr>
+                <m:sty m:val="i"/>
+              </m:rPr>
+              <m:t>K</m:t>
+            </m:r>
+          </m:e>
+        </m:box>
+      </m:oMath>
       <w:r>
         <w:t xml:space="preserve"> is the number of co-eluting peaks, and </w:t>
       </w:r>
-      <w:r>
-        <w:t>C_avg</w:t>
-      </w:r>
+      <m:oMath>
+        <m:box>
+          <m:e>
+            <m:sSub>
+              <m:e>
+                <m:r>
+                  <m:rPr>
+                    <m:sty m:val="i"/>
+                  </m:rPr>
+                  <m:t>C</m:t>
+                </m:r>
+              </m:e>
+              <m:sub>
+                <m:box>
+                  <m:e>
+                    <m:r>
+                      <m:rPr>
+                        <m:sty m:val="i"/>
+                      </m:rPr>
+                      <m:t>a</m:t>
+                    </m:r>
+                    <m:r>
+                      <m:rPr>
+                        <m:sty m:val="i"/>
+                      </m:rPr>
+                      <m:t>v</m:t>
+                    </m:r>
+                    <m:r>
+                      <m:rPr>
+                        <m:sty m:val="i"/>
+                      </m:rPr>
+                      <m:t>g</m:t>
+                    </m:r>
+                  </m:e>
+                </m:box>
+              </m:sub>
+            </m:sSub>
+          </m:e>
+        </m:box>
+      </m:oMath>
       <w:r>
         <w:t xml:space="preserve"> is the average pairwise spectral cosine similarity between peak apexes. This prevents graph over-smoothing in dense or highly-correlated clusters.</w:t>
       </w:r>
@@ -777,12 +2463,450 @@
     </w:p>
     <w:p>
       <w:pPr>
-        <w:spacing w:after="120" w:line="276" w:lineRule="auto"/>
+        <w:spacing w:after="240" w:line="276" w:lineRule="auto" w:before="120"/>
+        <w:jc w:val="center"/>
       </w:pPr>
       <w:r/>
-      <w:r>
-        <w:t>f(t; h, t_R, σ, τ) = h * (σ/τ) * √(π/2) * exp( σ²/(2τ²) - (t - t_R)/τ ) * erfc( σ/(√2 * τ) - (t - t_R)/(√2 * σ) )</w:t>
-      </w:r>
+      <m:oMath>
+        <m:box>
+          <m:e>
+            <m:r>
+              <m:rPr>
+                <m:sty m:val="i"/>
+              </m:rPr>
+              <m:t>f</m:t>
+            </m:r>
+            <m:r>
+              <m:rPr>
+                <m:sty m:val="p"/>
+              </m:rPr>
+              <m:t>(</m:t>
+            </m:r>
+            <m:r>
+              <m:rPr>
+                <m:sty m:val="i"/>
+              </m:rPr>
+              <m:t>t</m:t>
+            </m:r>
+            <m:r>
+              <m:rPr>
+                <m:sty m:val="i"/>
+              </m:rPr>
+              <m:t>;</m:t>
+            </m:r>
+            <m:r>
+              <m:rPr>
+                <m:sty m:val="i"/>
+              </m:rPr>
+              <m:t>h</m:t>
+            </m:r>
+            <m:r>
+              <m:rPr>
+                <m:sty m:val="p"/>
+              </m:rPr>
+              <m:t>,</m:t>
+            </m:r>
+            <m:sSub>
+              <m:e>
+                <m:r>
+                  <m:rPr>
+                    <m:sty m:val="i"/>
+                  </m:rPr>
+                  <m:t>t</m:t>
+                </m:r>
+              </m:e>
+              <m:sub>
+                <m:r>
+                  <m:rPr>
+                    <m:sty m:val="i"/>
+                  </m:rPr>
+                  <m:t>R</m:t>
+                </m:r>
+              </m:sub>
+            </m:sSub>
+            <m:r>
+              <m:rPr>
+                <m:sty m:val="p"/>
+              </m:rPr>
+              <m:t>,</m:t>
+            </m:r>
+            <m:r>
+              <m:rPr>
+                <m:sty m:val="i"/>
+              </m:rPr>
+              <m:t>σ</m:t>
+            </m:r>
+            <m:r>
+              <m:rPr>
+                <m:sty m:val="p"/>
+              </m:rPr>
+              <m:t>,</m:t>
+            </m:r>
+            <m:r>
+              <m:rPr>
+                <m:sty m:val="i"/>
+              </m:rPr>
+              <m:t>τ</m:t>
+            </m:r>
+            <m:r>
+              <m:rPr>
+                <m:sty m:val="p"/>
+              </m:rPr>
+              <m:t>)</m:t>
+            </m:r>
+            <m:r>
+              <m:rPr>
+                <m:sty m:val="p"/>
+              </m:rPr>
+              <m:t>=</m:t>
+            </m:r>
+            <m:r>
+              <m:rPr>
+                <m:sty m:val="i"/>
+              </m:rPr>
+              <m:t>h</m:t>
+            </m:r>
+            <m:f>
+              <m:num>
+                <m:box>
+                  <m:e>
+                    <m:r>
+                      <m:rPr>
+                        <m:sty m:val="i"/>
+                      </m:rPr>
+                      <m:t>σ</m:t>
+                    </m:r>
+                  </m:e>
+                </m:box>
+              </m:num>
+              <m:den>
+                <m:box>
+                  <m:e>
+                    <m:r>
+                      <m:rPr>
+                        <m:sty m:val="i"/>
+                      </m:rPr>
+                      <m:t>τ</m:t>
+                    </m:r>
+                  </m:e>
+                </m:box>
+              </m:den>
+            </m:f>
+            <m:rad>
+              <m:e>
+                <m:box>
+                  <m:e>
+                    <m:box>
+                      <m:e>
+                        <m:f>
+                          <m:num>
+                            <m:box>
+                              <m:e>
+                                <m:r>
+                                  <m:rPr>
+                                    <m:sty m:val="i"/>
+                                  </m:rPr>
+                                  <m:t>π</m:t>
+                                </m:r>
+                              </m:e>
+                            </m:box>
+                          </m:num>
+                          <m:den>
+                            <m:box>
+                              <m:e>
+                                <m:r>
+                                  <m:rPr>
+                                    <m:sty m:val="p"/>
+                                  </m:rPr>
+                                  <m:t>2</m:t>
+                                </m:r>
+                              </m:e>
+                            </m:box>
+                          </m:den>
+                        </m:f>
+                      </m:e>
+                    </m:box>
+                  </m:e>
+                </m:box>
+              </m:e>
+            </m:rad>
+            <m:r>
+              <m:rPr>
+                <m:sty m:val="p"/>
+              </m:rPr>
+              <m:t>exp</m:t>
+            </m:r>
+            <m:box>
+              <m:e>
+                <m:d>
+                  <m:dPr>
+                    <m:begChr m:val="("/>
+                    <m:endChr m:val=")"/>
+                  </m:dPr>
+                  <m:e>
+                    <m:box>
+                      <m:e>
+                        <m:f>
+                          <m:num>
+                            <m:box>
+                              <m:e>
+                                <m:sSup>
+                                  <m:e>
+                                    <m:r>
+                                      <m:rPr>
+                                        <m:sty m:val="i"/>
+                                      </m:rPr>
+                                      <m:t>σ</m:t>
+                                    </m:r>
+                                  </m:e>
+                                  <m:sup>
+                                    <m:r>
+                                      <m:rPr>
+                                        <m:sty m:val="p"/>
+                                      </m:rPr>
+                                      <m:t>2</m:t>
+                                    </m:r>
+                                  </m:sup>
+                                </m:sSup>
+                              </m:e>
+                            </m:box>
+                          </m:num>
+                          <m:den>
+                            <m:box>
+                              <m:e>
+                                <m:r>
+                                  <m:rPr>
+                                    <m:sty m:val="p"/>
+                                  </m:rPr>
+                                  <m:t>2</m:t>
+                                </m:r>
+                                <m:sSup>
+                                  <m:e>
+                                    <m:r>
+                                      <m:rPr>
+                                        <m:sty m:val="i"/>
+                                      </m:rPr>
+                                      <m:t>τ</m:t>
+                                    </m:r>
+                                  </m:e>
+                                  <m:sup>
+                                    <m:r>
+                                      <m:rPr>
+                                        <m:sty m:val="p"/>
+                                      </m:rPr>
+                                      <m:t>2</m:t>
+                                    </m:r>
+                                  </m:sup>
+                                </m:sSup>
+                              </m:e>
+                            </m:box>
+                          </m:den>
+                        </m:f>
+                        <m:r>
+                          <m:rPr>
+                            <m:sty m:val="p"/>
+                          </m:rPr>
+                          <m:t>−</m:t>
+                        </m:r>
+                        <m:f>
+                          <m:num>
+                            <m:box>
+                              <m:e>
+                                <m:r>
+                                  <m:rPr>
+                                    <m:sty m:val="i"/>
+                                  </m:rPr>
+                                  <m:t>t</m:t>
+                                </m:r>
+                                <m:r>
+                                  <m:rPr>
+                                    <m:sty m:val="p"/>
+                                  </m:rPr>
+                                  <m:t>−</m:t>
+                                </m:r>
+                                <m:sSub>
+                                  <m:e>
+                                    <m:r>
+                                      <m:rPr>
+                                        <m:sty m:val="i"/>
+                                      </m:rPr>
+                                      <m:t>t</m:t>
+                                    </m:r>
+                                  </m:e>
+                                  <m:sub>
+                                    <m:r>
+                                      <m:rPr>
+                                        <m:sty m:val="i"/>
+                                      </m:rPr>
+                                      <m:t>R</m:t>
+                                    </m:r>
+                                  </m:sub>
+                                </m:sSub>
+                              </m:e>
+                            </m:box>
+                          </m:num>
+                          <m:den>
+                            <m:box>
+                              <m:e>
+                                <m:r>
+                                  <m:rPr>
+                                    <m:sty m:val="i"/>
+                                  </m:rPr>
+                                  <m:t>τ</m:t>
+                                </m:r>
+                              </m:e>
+                            </m:box>
+                          </m:den>
+                        </m:f>
+                      </m:e>
+                    </m:box>
+                  </m:e>
+                </m:d>
+              </m:e>
+            </m:box>
+            <m:r>
+              <m:rPr>
+                <m:nor/>
+              </m:rPr>
+              <m:t>erfc</m:t>
+            </m:r>
+            <m:box>
+              <m:e>
+                <m:d>
+                  <m:dPr>
+                    <m:begChr m:val="("/>
+                    <m:endChr m:val=")"/>
+                  </m:dPr>
+                  <m:e>
+                    <m:box>
+                      <m:e>
+                        <m:f>
+                          <m:num>
+                            <m:box>
+                              <m:e>
+                                <m:r>
+                                  <m:rPr>
+                                    <m:sty m:val="i"/>
+                                  </m:rPr>
+                                  <m:t>σ</m:t>
+                                </m:r>
+                              </m:e>
+                            </m:box>
+                          </m:num>
+                          <m:den>
+                            <m:box>
+                              <m:e>
+                                <m:rad>
+                                  <m:e>
+                                    <m:box>
+                                      <m:e>
+                                        <m:box>
+                                          <m:e>
+                                            <m:r>
+                                              <m:rPr>
+                                                <m:sty m:val="p"/>
+                                              </m:rPr>
+                                              <m:t>2</m:t>
+                                            </m:r>
+                                          </m:e>
+                                        </m:box>
+                                      </m:e>
+                                    </m:box>
+                                  </m:e>
+                                </m:rad>
+                                <m:r>
+                                  <m:rPr>
+                                    <m:sty m:val="i"/>
+                                  </m:rPr>
+                                  <m:t>τ</m:t>
+                                </m:r>
+                              </m:e>
+                            </m:box>
+                          </m:den>
+                        </m:f>
+                        <m:r>
+                          <m:rPr>
+                            <m:sty m:val="p"/>
+                          </m:rPr>
+                          <m:t>−</m:t>
+                        </m:r>
+                        <m:f>
+                          <m:num>
+                            <m:box>
+                              <m:e>
+                                <m:r>
+                                  <m:rPr>
+                                    <m:sty m:val="i"/>
+                                  </m:rPr>
+                                  <m:t>t</m:t>
+                                </m:r>
+                                <m:r>
+                                  <m:rPr>
+                                    <m:sty m:val="p"/>
+                                  </m:rPr>
+                                  <m:t>−</m:t>
+                                </m:r>
+                                <m:sSub>
+                                  <m:e>
+                                    <m:r>
+                                      <m:rPr>
+                                        <m:sty m:val="i"/>
+                                      </m:rPr>
+                                      <m:t>t</m:t>
+                                    </m:r>
+                                  </m:e>
+                                  <m:sub>
+                                    <m:r>
+                                      <m:rPr>
+                                        <m:sty m:val="i"/>
+                                      </m:rPr>
+                                      <m:t>R</m:t>
+                                    </m:r>
+                                  </m:sub>
+                                </m:sSub>
+                              </m:e>
+                            </m:box>
+                          </m:num>
+                          <m:den>
+                            <m:box>
+                              <m:e>
+                                <m:rad>
+                                  <m:e>
+                                    <m:box>
+                                      <m:e>
+                                        <m:box>
+                                          <m:e>
+                                            <m:r>
+                                              <m:rPr>
+                                                <m:sty m:val="p"/>
+                                              </m:rPr>
+                                              <m:t>2</m:t>
+                                            </m:r>
+                                          </m:e>
+                                        </m:box>
+                                      </m:e>
+                                    </m:box>
+                                  </m:e>
+                                </m:rad>
+                                <m:r>
+                                  <m:rPr>
+                                    <m:sty m:val="i"/>
+                                  </m:rPr>
+                                  <m:t>σ</m:t>
+                                </m:r>
+                              </m:e>
+                            </m:box>
+                          </m:den>
+                        </m:f>
+                      </m:e>
+                    </m:box>
+                  </m:e>
+                </m:d>
+              </m:e>
+            </m:box>
+          </m:e>
+        </m:box>
+      </m:oMath>
       <w:r/>
     </w:p>
     <w:p>
@@ -792,33 +2916,102 @@
       <w:r>
         <w:t xml:space="preserve">where </w:t>
       </w:r>
-      <w:r>
-        <w:t>h</w:t>
-      </w:r>
+      <m:oMath>
+        <m:box>
+          <m:e>
+            <m:r>
+              <m:rPr>
+                <m:sty m:val="i"/>
+              </m:rPr>
+              <m:t>h</m:t>
+            </m:r>
+          </m:e>
+        </m:box>
+      </m:oMath>
       <w:r>
         <w:t xml:space="preserve"> is height, </w:t>
       </w:r>
-      <w:r>
-        <w:t>t_R</w:t>
-      </w:r>
+      <m:oMath>
+        <m:box>
+          <m:e>
+            <m:sSub>
+              <m:e>
+                <m:r>
+                  <m:rPr>
+                    <m:sty m:val="i"/>
+                  </m:rPr>
+                  <m:t>t</m:t>
+                </m:r>
+              </m:e>
+              <m:sub>
+                <m:r>
+                  <m:rPr>
+                    <m:sty m:val="i"/>
+                  </m:rPr>
+                  <m:t>R</m:t>
+                </m:r>
+              </m:sub>
+            </m:sSub>
+          </m:e>
+        </m:box>
+      </m:oMath>
       <w:r>
         <w:t xml:space="preserve"> is retention time, </w:t>
       </w:r>
-      <w:r>
-        <w:t>σ</w:t>
-      </w:r>
+      <m:oMath>
+        <m:box>
+          <m:e>
+            <m:r>
+              <m:rPr>
+                <m:sty m:val="i"/>
+              </m:rPr>
+              <m:t>σ</m:t>
+            </m:r>
+          </m:e>
+        </m:box>
+      </m:oMath>
       <w:r>
         <w:t xml:space="preserve"> is Gaussian width, and </w:t>
       </w:r>
-      <w:r>
-        <w:t>τ</w:t>
-      </w:r>
+      <m:oMath>
+        <m:box>
+          <m:e>
+            <m:r>
+              <m:rPr>
+                <m:sty m:val="i"/>
+              </m:rPr>
+              <m:t>τ</m:t>
+            </m:r>
+          </m:e>
+        </m:box>
+      </m:oMath>
       <w:r>
         <w:t xml:space="preserve"> is exponential relaxation time. To prevent CPU hangs on large clusters (</w:t>
       </w:r>
-      <w:r>
-        <w:t>K &gt; 5</w:t>
-      </w:r>
+      <m:oMath>
+        <m:box>
+          <m:e>
+            <m:r>
+              <m:rPr>
+                <m:sty m:val="i"/>
+              </m:rPr>
+              <m:t>K</m:t>
+            </m:r>
+            <m:r>
+              <m:rPr>
+                <m:sty m:val="p"/>
+              </m:rPr>
+              <m:t>&gt;</m:t>
+            </m:r>
+            <m:r>
+              <m:rPr>
+                <m:sty m:val="p"/>
+              </m:rPr>
+              <m:t>5</m:t>
+            </m:r>
+          </m:e>
+        </m:box>
+      </m:oMath>
       <w:r>
         <w:t>), a fallback mechanism automatically skips non-linear curve fitting and resolves areas directly from fast GCN node class probabilities.</w:t>
       </w:r>
@@ -833,12 +3026,339 @@
     </w:p>
     <w:p>
       <w:pPr>
-        <w:spacing w:after="120" w:line="276" w:lineRule="auto"/>
+        <w:spacing w:after="240" w:line="276" w:lineRule="auto" w:before="120"/>
+        <w:jc w:val="center"/>
       </w:pPr>
       <w:r/>
-      <w:r>
-        <w:t>h_i^(l+1) = σ( W^(l) * Σ_[j ∈ N(i) ∪ {i}] (1 / √(d_i * d_j)) * h_j^(l) )</w:t>
-      </w:r>
+      <m:oMath>
+        <m:box>
+          <m:e>
+            <m:sSubSup>
+              <m:e>
+                <m:r>
+                  <m:rPr>
+                    <m:sty m:val="i"/>
+                  </m:rPr>
+                  <m:t>𝐡</m:t>
+                </m:r>
+              </m:e>
+              <m:sub>
+                <m:r>
+                  <m:rPr>
+                    <m:sty m:val="i"/>
+                  </m:rPr>
+                  <m:t>i</m:t>
+                </m:r>
+              </m:sub>
+              <m:sup>
+                <m:box>
+                  <m:e>
+                    <m:r>
+                      <m:rPr>
+                        <m:sty m:val="p"/>
+                      </m:rPr>
+                      <m:t>(</m:t>
+                    </m:r>
+                    <m:r>
+                      <m:rPr>
+                        <m:sty m:val="i"/>
+                      </m:rPr>
+                      <m:t>l</m:t>
+                    </m:r>
+                    <m:r>
+                      <m:rPr>
+                        <m:sty m:val="p"/>
+                      </m:rPr>
+                      <m:t>+</m:t>
+                    </m:r>
+                    <m:r>
+                      <m:rPr>
+                        <m:sty m:val="p"/>
+                      </m:rPr>
+                      <m:t>1</m:t>
+                    </m:r>
+                    <m:r>
+                      <m:rPr>
+                        <m:sty m:val="p"/>
+                      </m:rPr>
+                      <m:t>)</m:t>
+                    </m:r>
+                  </m:e>
+                </m:box>
+              </m:sup>
+            </m:sSubSup>
+            <m:r>
+              <m:rPr>
+                <m:sty m:val="p"/>
+              </m:rPr>
+              <m:t>=</m:t>
+            </m:r>
+            <m:r>
+              <m:rPr>
+                <m:sty m:val="i"/>
+              </m:rPr>
+              <m:t>σ</m:t>
+            </m:r>
+            <m:box>
+              <m:e>
+                <m:d>
+                  <m:dPr>
+                    <m:begChr m:val="("/>
+                    <m:endChr m:val=")"/>
+                  </m:dPr>
+                  <m:e>
+                    <m:box>
+                      <m:e>
+                        <m:sSup>
+                          <m:e>
+                            <m:r>
+                              <m:rPr>
+                                <m:sty m:val="i"/>
+                              </m:rPr>
+                              <m:t>𝐖</m:t>
+                            </m:r>
+                          </m:e>
+                          <m:sup>
+                            <m:box>
+                              <m:e>
+                                <m:r>
+                                  <m:rPr>
+                                    <m:sty m:val="p"/>
+                                  </m:rPr>
+                                  <m:t>(</m:t>
+                                </m:r>
+                                <m:r>
+                                  <m:rPr>
+                                    <m:sty m:val="i"/>
+                                  </m:rPr>
+                                  <m:t>l</m:t>
+                                </m:r>
+                                <m:r>
+                                  <m:rPr>
+                                    <m:sty m:val="p"/>
+                                  </m:rPr>
+                                  <m:t>)</m:t>
+                                </m:r>
+                              </m:e>
+                            </m:box>
+                          </m:sup>
+                        </m:sSup>
+                        <m:nary>
+                          <m:naryPr>
+                            <m:chr m:val="∑"/>
+                            <m:limLoc m:val="undOvr"/>
+                          </m:naryPr>
+                          <m:sub>
+                            <m:box>
+                              <m:e>
+                                <m:r>
+                                  <m:rPr>
+                                    <m:sty m:val="i"/>
+                                  </m:rPr>
+                                  <m:t>j</m:t>
+                                </m:r>
+                                <m:r>
+                                  <m:rPr>
+                                    <m:sty m:val="p"/>
+                                  </m:rPr>
+                                  <m:t>∈</m:t>
+                                </m:r>
+                                <m:r>
+                                  <m:rPr>
+                                    <m:sty m:val="i"/>
+                                  </m:rPr>
+                                  <m:t>𝒩</m:t>
+                                </m:r>
+                                <m:r>
+                                  <m:rPr>
+                                    <m:sty m:val="p"/>
+                                  </m:rPr>
+                                  <m:t>(</m:t>
+                                </m:r>
+                                <m:r>
+                                  <m:rPr>
+                                    <m:sty m:val="i"/>
+                                  </m:rPr>
+                                  <m:t>i</m:t>
+                                </m:r>
+                                <m:r>
+                                  <m:rPr>
+                                    <m:sty m:val="p"/>
+                                  </m:rPr>
+                                  <m:t>)</m:t>
+                                </m:r>
+                                <m:r>
+                                  <m:rPr>
+                                    <m:sty m:val="p"/>
+                                  </m:rPr>
+                                  <m:t>∪</m:t>
+                                </m:r>
+                                <m:r>
+                                  <m:rPr>
+                                    <m:sty m:val="p"/>
+                                  </m:rPr>
+                                  <m:t>{</m:t>
+                                </m:r>
+                                <m:r>
+                                  <m:rPr>
+                                    <m:sty m:val="i"/>
+                                  </m:rPr>
+                                  <m:t>i</m:t>
+                                </m:r>
+                                <m:r>
+                                  <m:rPr>
+                                    <m:sty m:val="p"/>
+                                  </m:rPr>
+                                  <m:t>}</m:t>
+                                </m:r>
+                              </m:e>
+                            </m:box>
+                          </m:sub>
+                          <m:sup/>
+                          <m:e>
+                            <m:f>
+                              <m:num>
+                                <m:box>
+                                  <m:e>
+                                    <m:r>
+                                      <m:rPr>
+                                        <m:sty m:val="p"/>
+                                      </m:rPr>
+                                      <m:t>1</m:t>
+                                    </m:r>
+                                  </m:e>
+                                </m:box>
+                              </m:num>
+                              <m:den>
+                                <m:box>
+                                  <m:e>
+                                    <m:rad>
+                                      <m:e>
+                                        <m:box>
+                                          <m:e>
+                                            <m:box>
+                                              <m:e>
+                                                <m:sSub>
+                                                  <m:e>
+                                                    <m:acc>
+                                                      <m:accPr>
+                                                        <m:chr m:val="̃"/>
+                                                      </m:accPr>
+                                                      <m:e>
+                                                        <m:box>
+                                                          <m:e>
+                                                            <m:r>
+                                                              <m:rPr>
+                                                                <m:sty m:val="i"/>
+                                                              </m:rPr>
+                                                              <m:t>d</m:t>
+                                                            </m:r>
+                                                          </m:e>
+                                                        </m:box>
+                                                      </m:e>
+                                                    </m:acc>
+                                                  </m:e>
+                                                  <m:sub>
+                                                    <m:r>
+                                                      <m:rPr>
+                                                        <m:sty m:val="i"/>
+                                                      </m:rPr>
+                                                      <m:t>i</m:t>
+                                                    </m:r>
+                                                  </m:sub>
+                                                </m:sSub>
+                                                <m:sSub>
+                                                  <m:e>
+                                                    <m:acc>
+                                                      <m:accPr>
+                                                        <m:chr m:val="̃"/>
+                                                      </m:accPr>
+                                                      <m:e>
+                                                        <m:box>
+                                                          <m:e>
+                                                            <m:r>
+                                                              <m:rPr>
+                                                                <m:sty m:val="i"/>
+                                                              </m:rPr>
+                                                              <m:t>d</m:t>
+                                                            </m:r>
+                                                          </m:e>
+                                                        </m:box>
+                                                      </m:e>
+                                                    </m:acc>
+                                                  </m:e>
+                                                  <m:sub>
+                                                    <m:r>
+                                                      <m:rPr>
+                                                        <m:sty m:val="i"/>
+                                                      </m:rPr>
+                                                      <m:t>j</m:t>
+                                                    </m:r>
+                                                  </m:sub>
+                                                </m:sSub>
+                                              </m:e>
+                                            </m:box>
+                                          </m:e>
+                                        </m:box>
+                                      </m:e>
+                                    </m:rad>
+                                  </m:e>
+                                </m:box>
+                              </m:den>
+                            </m:f>
+                            <m:sSubSup>
+                              <m:e>
+                                <m:r>
+                                  <m:rPr>
+                                    <m:sty m:val="i"/>
+                                  </m:rPr>
+                                  <m:t>𝐡</m:t>
+                                </m:r>
+                              </m:e>
+                              <m:sub>
+                                <m:r>
+                                  <m:rPr>
+                                    <m:sty m:val="i"/>
+                                  </m:rPr>
+                                  <m:t>j</m:t>
+                                </m:r>
+                              </m:sub>
+                              <m:sup>
+                                <m:box>
+                                  <m:e>
+                                    <m:r>
+                                      <m:rPr>
+                                        <m:sty m:val="p"/>
+                                      </m:rPr>
+                                      <m:t>(</m:t>
+                                    </m:r>
+                                    <m:r>
+                                      <m:rPr>
+                                        <m:sty m:val="i"/>
+                                      </m:rPr>
+                                      <m:t>l</m:t>
+                                    </m:r>
+                                    <m:r>
+                                      <m:rPr>
+                                        <m:sty m:val="p"/>
+                                      </m:rPr>
+                                      <m:t>)</m:t>
+                                    </m:r>
+                                  </m:e>
+                                </m:box>
+                              </m:sup>
+                            </m:sSubSup>
+                          </m:e>
+                        </m:nary>
+                      </m:e>
+                    </m:box>
+                  </m:e>
+                </m:d>
+              </m:e>
+            </m:box>
+          </m:e>
+        </m:box>
+      </m:oMath>
       <w:r/>
     </w:p>
     <w:p>
@@ -859,12 +3379,108 @@
     </w:p>
     <w:p>
       <w:pPr>
-        <w:spacing w:after="120" w:line="276" w:lineRule="auto"/>
+        <w:spacing w:after="240" w:line="276" w:lineRule="auto" w:before="120"/>
+        <w:jc w:val="center"/>
       </w:pPr>
       <w:r/>
-      <w:r>
-        <w:t>S_C = (u · v) / (||u|| * ||v||)</w:t>
-      </w:r>
+      <m:oMath>
+        <m:box>
+          <m:e>
+            <m:sSub>
+              <m:e>
+                <m:r>
+                  <m:rPr>
+                    <m:sty m:val="i"/>
+                  </m:rPr>
+                  <m:t>S</m:t>
+                </m:r>
+              </m:e>
+              <m:sub>
+                <m:r>
+                  <m:rPr>
+                    <m:sty m:val="i"/>
+                  </m:rPr>
+                  <m:t>C</m:t>
+                </m:r>
+              </m:sub>
+            </m:sSub>
+            <m:r>
+              <m:rPr>
+                <m:sty m:val="p"/>
+              </m:rPr>
+              <m:t>=</m:t>
+            </m:r>
+            <m:f>
+              <m:num>
+                <m:box>
+                  <m:e>
+                    <m:r>
+                      <m:rPr>
+                        <m:sty m:val="i"/>
+                      </m:rPr>
+                      <m:t>𝐮</m:t>
+                    </m:r>
+                    <m:r>
+                      <m:rPr>
+                        <m:sty m:val="p"/>
+                      </m:rPr>
+                      <m:t>·</m:t>
+                    </m:r>
+                    <m:r>
+                      <m:rPr>
+                        <m:sty m:val="i"/>
+                      </m:rPr>
+                      <m:t>𝐯</m:t>
+                    </m:r>
+                  </m:e>
+                </m:box>
+              </m:num>
+              <m:den>
+                <m:box>
+                  <m:e>
+                    <m:r>
+                      <m:rPr>
+                        <m:sty m:val="p"/>
+                      </m:rPr>
+                      <m:t>‖</m:t>
+                    </m:r>
+                    <m:r>
+                      <m:rPr>
+                        <m:sty m:val="i"/>
+                      </m:rPr>
+                      <m:t>𝐮</m:t>
+                    </m:r>
+                    <m:r>
+                      <m:rPr>
+                        <m:sty m:val="p"/>
+                      </m:rPr>
+                      <m:t>‖</m:t>
+                    </m:r>
+                    <m:r>
+                      <m:rPr>
+                        <m:sty m:val="p"/>
+                      </m:rPr>
+                      <m:t>‖</m:t>
+                    </m:r>
+                    <m:r>
+                      <m:rPr>
+                        <m:sty m:val="i"/>
+                      </m:rPr>
+                      <m:t>𝐯</m:t>
+                    </m:r>
+                    <m:r>
+                      <m:rPr>
+                        <m:sty m:val="p"/>
+                      </m:rPr>
+                      <m:t>‖</m:t>
+                    </m:r>
+                  </m:e>
+                </m:box>
+              </m:den>
+            </m:f>
+          </m:e>
+        </m:box>
+      </m:oMath>
       <w:r/>
     </w:p>
     <w:p>
@@ -874,9 +3490,30 @@
       <w:r>
         <w:t xml:space="preserve">If local matches are below 0.7, the pipeline queries OpenRouter APIs via a LiteLLM proxy. It also looks for diagnostic fragments (like </w:t>
       </w:r>
-      <w:r>
-        <w:t>m/z</w:t>
-      </w:r>
+      <m:oMath>
+        <m:box>
+          <m:e>
+            <m:r>
+              <m:rPr>
+                <m:sty m:val="i"/>
+              </m:rPr>
+              <m:t>m</m:t>
+            </m:r>
+            <m:r>
+              <m:rPr>
+                <m:sty m:val="p"/>
+              </m:rPr>
+              <m:t>/</m:t>
+            </m:r>
+            <m:r>
+              <m:rPr>
+                <m:sty m:val="i"/>
+              </m:rPr>
+              <m:t>z</m:t>
+            </m:r>
+          </m:e>
+        </m:box>
+      </m:oMath>
       <w:r>
         <w:t xml:space="preserve"> 73 and 147 for TMS derivatization) to tag compound names.</w:t>
       </w:r>
@@ -999,31 +3636,250 @@
       <w:r>
         <w:t>To check residual solvents in active pharmaceutical ingredients, the pipeline calculates concentrations in parts-per-million (</w:t>
       </w:r>
-      <w:r>
-        <w:t>ppm</w:t>
-      </w:r>
+      <m:oMath>
+        <m:box>
+          <m:e>
+            <m:r>
+              <m:rPr>
+                <m:sty m:val="i"/>
+              </m:rPr>
+              <m:t>p</m:t>
+            </m:r>
+            <m:r>
+              <m:rPr>
+                <m:sty m:val="i"/>
+              </m:rPr>
+              <m:t>p</m:t>
+            </m:r>
+            <m:r>
+              <m:rPr>
+                <m:sty m:val="i"/>
+              </m:rPr>
+              <m:t>m</m:t>
+            </m:r>
+          </m:e>
+        </m:box>
+      </m:oMath>
       <w:r>
         <w:t>) following USP &lt;467&gt; guidelines:</w:t>
       </w:r>
     </w:p>
     <w:p>
       <w:pPr>
-        <w:spacing w:after="120" w:line="276" w:lineRule="auto"/>
+        <w:spacing w:after="240" w:line="276" w:lineRule="auto" w:before="120"/>
+        <w:jc w:val="center"/>
       </w:pPr>
       <w:r/>
-      <w:r>
-        <w:t>Response Factor = A_std / C_std</w:t>
-      </w:r>
+      <m:oMath>
+        <m:box>
+          <m:e>
+            <m:r>
+              <m:rPr>
+                <m:nor/>
+              </m:rPr>
+              <m:t>Response Factor</m:t>
+            </m:r>
+            <m:r>
+              <m:rPr>
+                <m:sty m:val="p"/>
+              </m:rPr>
+              <m:t>=</m:t>
+            </m:r>
+            <m:f>
+              <m:num>
+                <m:box>
+                  <m:e>
+                    <m:sSub>
+                      <m:e>
+                        <m:r>
+                          <m:rPr>
+                            <m:sty m:val="i"/>
+                          </m:rPr>
+                          <m:t>A</m:t>
+                        </m:r>
+                      </m:e>
+                      <m:sub>
+                        <m:box>
+                          <m:e>
+                            <m:r>
+                              <m:rPr>
+                                <m:sty m:val="i"/>
+                              </m:rPr>
+                              <m:t>s</m:t>
+                            </m:r>
+                            <m:r>
+                              <m:rPr>
+                                <m:sty m:val="i"/>
+                              </m:rPr>
+                              <m:t>t</m:t>
+                            </m:r>
+                            <m:r>
+                              <m:rPr>
+                                <m:sty m:val="i"/>
+                              </m:rPr>
+                              <m:t>d</m:t>
+                            </m:r>
+                          </m:e>
+                        </m:box>
+                      </m:sub>
+                    </m:sSub>
+                  </m:e>
+                </m:box>
+              </m:num>
+              <m:den>
+                <m:box>
+                  <m:e>
+                    <m:sSub>
+                      <m:e>
+                        <m:r>
+                          <m:rPr>
+                            <m:sty m:val="i"/>
+                          </m:rPr>
+                          <m:t>C</m:t>
+                        </m:r>
+                      </m:e>
+                      <m:sub>
+                        <m:box>
+                          <m:e>
+                            <m:r>
+                              <m:rPr>
+                                <m:sty m:val="i"/>
+                              </m:rPr>
+                              <m:t>s</m:t>
+                            </m:r>
+                            <m:r>
+                              <m:rPr>
+                                <m:sty m:val="i"/>
+                              </m:rPr>
+                              <m:t>t</m:t>
+                            </m:r>
+                            <m:r>
+                              <m:rPr>
+                                <m:sty m:val="i"/>
+                              </m:rPr>
+                              <m:t>d</m:t>
+                            </m:r>
+                          </m:e>
+                        </m:box>
+                      </m:sub>
+                    </m:sSub>
+                  </m:e>
+                </m:box>
+              </m:den>
+            </m:f>
+          </m:e>
+        </m:box>
+      </m:oMath>
       <w:r/>
     </w:p>
     <w:p>
       <w:pPr>
-        <w:spacing w:after="120" w:line="276" w:lineRule="auto"/>
+        <w:spacing w:after="240" w:line="276" w:lineRule="auto" w:before="120"/>
+        <w:jc w:val="center"/>
       </w:pPr>
       <w:r/>
-      <w:r>
-        <w:t>Concentration (ppm) = A_sample / (Response Factor * Sample Weight)</w:t>
-      </w:r>
+      <m:oMath>
+        <m:box>
+          <m:e>
+            <m:r>
+              <m:rPr>
+                <m:nor/>
+              </m:rPr>
+              <m:t>Concentration (ppm)</m:t>
+            </m:r>
+            <m:r>
+              <m:rPr>
+                <m:sty m:val="p"/>
+              </m:rPr>
+              <m:t>=</m:t>
+            </m:r>
+            <m:f>
+              <m:num>
+                <m:box>
+                  <m:e>
+                    <m:sSub>
+                      <m:e>
+                        <m:r>
+                          <m:rPr>
+                            <m:sty m:val="i"/>
+                          </m:rPr>
+                          <m:t>A</m:t>
+                        </m:r>
+                      </m:e>
+                      <m:sub>
+                        <m:box>
+                          <m:e>
+                            <m:r>
+                              <m:rPr>
+                                <m:sty m:val="i"/>
+                              </m:rPr>
+                              <m:t>s</m:t>
+                            </m:r>
+                            <m:r>
+                              <m:rPr>
+                                <m:sty m:val="i"/>
+                              </m:rPr>
+                              <m:t>a</m:t>
+                            </m:r>
+                            <m:r>
+                              <m:rPr>
+                                <m:sty m:val="i"/>
+                              </m:rPr>
+                              <m:t>m</m:t>
+                            </m:r>
+                            <m:r>
+                              <m:rPr>
+                                <m:sty m:val="i"/>
+                              </m:rPr>
+                              <m:t>p</m:t>
+                            </m:r>
+                            <m:r>
+                              <m:rPr>
+                                <m:sty m:val="i"/>
+                              </m:rPr>
+                              <m:t>l</m:t>
+                            </m:r>
+                            <m:r>
+                              <m:rPr>
+                                <m:sty m:val="i"/>
+                              </m:rPr>
+                              <m:t>e</m:t>
+                            </m:r>
+                          </m:e>
+                        </m:box>
+                      </m:sub>
+                    </m:sSub>
+                  </m:e>
+                </m:box>
+              </m:num>
+              <m:den>
+                <m:box>
+                  <m:e>
+                    <m:r>
+                      <m:rPr>
+                        <m:nor/>
+                      </m:rPr>
+                      <m:t>Response Factor</m:t>
+                    </m:r>
+                    <m:r>
+                      <m:rPr>
+                        <m:sty m:val="p"/>
+                      </m:rPr>
+                      <m:t>×</m:t>
+                    </m:r>
+                    <m:r>
+                      <m:rPr>
+                        <m:nor/>
+                      </m:rPr>
+                      <m:t>Sample Weight</m:t>
+                    </m:r>
+                  </m:e>
+                </m:box>
+              </m:den>
+            </m:f>
+          </m:e>
+        </m:box>
+      </m:oMath>
       <w:r/>
     </w:p>
     <w:p>
@@ -1259,15 +4115,75 @@
       <w:r>
         <w:t xml:space="preserve"> Warping paths are calculated within a diagonal constraint band (</w:t>
       </w:r>
-      <w:r>
-        <w:t>w = 15.0</w:t>
-      </w:r>
+      <m:oMath>
+        <m:box>
+          <m:e>
+            <m:r>
+              <m:rPr>
+                <m:sty m:val="i"/>
+              </m:rPr>
+              <m:t>w</m:t>
+            </m:r>
+            <m:r>
+              <m:rPr>
+                <m:sty m:val="p"/>
+              </m:rPr>
+              <m:t>=</m:t>
+            </m:r>
+            <m:r>
+              <m:rPr>
+                <m:sty m:val="p"/>
+              </m:rPr>
+              <m:t>15.0</m:t>
+            </m:r>
+          </m:e>
+        </m:box>
+      </m:oMath>
       <w:r>
         <w:t xml:space="preserve"> seconds) to prevent non-physical warpings and keep matrix space complexity </w:t>
       </w:r>
-      <w:r>
-        <w:t>O(N · w)</w:t>
-      </w:r>
+      <m:oMath>
+        <m:box>
+          <m:e>
+            <m:r>
+              <m:rPr>
+                <m:sty m:val="i"/>
+              </m:rPr>
+              <m:t>O</m:t>
+            </m:r>
+            <m:r>
+              <m:rPr>
+                <m:sty m:val="p"/>
+              </m:rPr>
+              <m:t>(</m:t>
+            </m:r>
+            <m:r>
+              <m:rPr>
+                <m:sty m:val="i"/>
+              </m:rPr>
+              <m:t>N</m:t>
+            </m:r>
+            <m:r>
+              <m:rPr>
+                <m:sty m:val="p"/>
+              </m:rPr>
+              <m:t>·</m:t>
+            </m:r>
+            <m:r>
+              <m:rPr>
+                <m:sty m:val="i"/>
+              </m:rPr>
+              <m:t>w</m:t>
+            </m:r>
+            <m:r>
+              <m:rPr>
+                <m:sty m:val="p"/>
+              </m:rPr>
+              <m:t>)</m:t>
+            </m:r>
+          </m:e>
+        </m:box>
+      </m:oMath>
       <w:r>
         <w:t>.</w:t>
       </w:r>
@@ -1360,9 +4276,30 @@
       <w:r>
         <w:t xml:space="preserve">) for records with category index </w:t>
       </w:r>
-      <w:r>
-        <w:t>d ≥ 8</w:t>
-      </w:r>
+      <m:oMath>
+        <m:box>
+          <m:e>
+            <m:r>
+              <m:rPr>
+                <m:sty m:val="i"/>
+              </m:rPr>
+              <m:t>d</m:t>
+            </m:r>
+            <m:r>
+              <m:rPr>
+                <m:sty m:val="p"/>
+              </m:rPr>
+              <m:t>≥</m:t>
+            </m:r>
+            <m:r>
+              <m:rPr>
+                <m:sty m:val="p"/>
+              </m:rPr>
+              <m:t>8</m:t>
+            </m:r>
+          </m:e>
+        </m:box>
+      </m:oMath>
       <w:r>
         <w:t>. This resolved prior height-math overflow errors and scaled intensities correctly.</w:t>
       </w:r>

</xml_diff>